<commit_message>
2025 fixes,  via Keith
</commit_message>
<xml_diff>
--- a/Author_Template/ManuscriptInstructions.docx
+++ b/Author_Template/ManuscriptInstructions.docx
@@ -1,10 +1,10 @@
 
 <file path=word/document.xml><?xml version="1.0" encoding="utf-8"?>
-<w:document xmlns:wpc="http://schemas.microsoft.com/office/word/2010/wordprocessingCanvas" xmlns:cx="http://schemas.microsoft.com/office/drawing/2014/chartex" xmlns:cx1="http://schemas.microsoft.com/office/drawing/2015/9/8/chartex" xmlns:cx2="http://schemas.microsoft.com/office/drawing/2015/10/21/chartex" xmlns:cx3="http://schemas.microsoft.com/office/drawing/2016/5/9/chartex" xmlns:cx4="http://schemas.microsoft.com/office/drawing/2016/5/10/chartex" xmlns:cx5="http://schemas.microsoft.com/office/drawing/2016/5/11/chartex" xmlns:cx6="http://schemas.microsoft.com/office/drawing/2016/5/12/chartex" xmlns:cx7="http://schemas.microsoft.com/office/drawing/2016/5/13/chartex" xmlns:cx8="http://schemas.microsoft.com/office/drawing/2016/5/14/chartex" xmlns:mc="http://schemas.openxmlformats.org/markup-compatibility/2006" xmlns:aink="http://schemas.microsoft.com/office/drawing/2016/ink" xmlns:am3d="http://schemas.microsoft.com/office/drawing/2017/model3d" xmlns:o="urn:schemas-microsoft-com:office:office" xmlns:oel="http://schemas.microsoft.com/office/2019/extlst" xmlns:r="http://schemas.openxmlformats.org/officeDocument/2006/relationships" xmlns:m="http://schemas.openxmlformats.org/officeDocument/2006/math" xmlns:v="urn:schemas-microsoft-com:vml" xmlns:wp14="http://schemas.microsoft.com/office/word/2010/wordprocessingDrawing" xmlns:wp="http://schemas.openxmlformats.org/drawingml/2006/wordprocessingDrawing" xmlns:w10="urn:schemas-microsoft-com:office:word" xmlns:w="http://schemas.openxmlformats.org/wordprocessingml/2006/main" xmlns:w14="http://schemas.microsoft.com/office/word/2010/wordml" xmlns:w15="http://schemas.microsoft.com/office/word/2012/wordml" xmlns:w16cex="http://schemas.microsoft.com/office/word/2018/wordml/cex" xmlns:w16cid="http://schemas.microsoft.com/office/word/2016/wordml/cid" xmlns:w16="http://schemas.microsoft.com/office/word/2018/wordml" xmlns:w16sdtdh="http://schemas.microsoft.com/office/word/2020/wordml/sdtdatahash" xmlns:w16se="http://schemas.microsoft.com/office/word/2015/wordml/symex" xmlns:wpg="http://schemas.microsoft.com/office/word/2010/wordprocessingGroup" xmlns:wpi="http://schemas.microsoft.com/office/word/2010/wordprocessingInk" xmlns:wne="http://schemas.microsoft.com/office/word/2006/wordml" xmlns:wps="http://schemas.microsoft.com/office/word/2010/wordprocessingShape" mc:Ignorable="w14 w15 w16se w16cid w16 w16cex w16sdtdh wp14">
+<w:document xmlns:wpc="http://schemas.microsoft.com/office/word/2010/wordprocessingCanvas" xmlns:cx="http://schemas.microsoft.com/office/drawing/2014/chartex" xmlns:cx1="http://schemas.microsoft.com/office/drawing/2015/9/8/chartex" xmlns:cx2="http://schemas.microsoft.com/office/drawing/2015/10/21/chartex" xmlns:cx3="http://schemas.microsoft.com/office/drawing/2016/5/9/chartex" xmlns:cx4="http://schemas.microsoft.com/office/drawing/2016/5/10/chartex" xmlns:cx5="http://schemas.microsoft.com/office/drawing/2016/5/11/chartex" xmlns:cx6="http://schemas.microsoft.com/office/drawing/2016/5/12/chartex" xmlns:cx7="http://schemas.microsoft.com/office/drawing/2016/5/13/chartex" xmlns:cx8="http://schemas.microsoft.com/office/drawing/2016/5/14/chartex" xmlns:mc="http://schemas.openxmlformats.org/markup-compatibility/2006" xmlns:aink="http://schemas.microsoft.com/office/drawing/2016/ink" xmlns:am3d="http://schemas.microsoft.com/office/drawing/2017/model3d" xmlns:o="urn:schemas-microsoft-com:office:office" xmlns:oel="http://schemas.microsoft.com/office/2019/extlst" xmlns:r="http://schemas.openxmlformats.org/officeDocument/2006/relationships" xmlns:m="http://schemas.openxmlformats.org/officeDocument/2006/math" xmlns:v="urn:schemas-microsoft-com:vml" xmlns:wp14="http://schemas.microsoft.com/office/word/2010/wordprocessingDrawing" xmlns:wp="http://schemas.openxmlformats.org/drawingml/2006/wordprocessingDrawing" xmlns:w10="urn:schemas-microsoft-com:office:word" xmlns:w="http://schemas.openxmlformats.org/wordprocessingml/2006/main" xmlns:w14="http://schemas.microsoft.com/office/word/2010/wordml" xmlns:w15="http://schemas.microsoft.com/office/word/2012/wordml" xmlns:w16cex="http://schemas.microsoft.com/office/word/2018/wordml/cex" xmlns:w16cid="http://schemas.microsoft.com/office/word/2016/wordml/cid" xmlns:w16="http://schemas.microsoft.com/office/word/2018/wordml" xmlns:w16du="http://schemas.microsoft.com/office/word/2023/wordml/word16du" xmlns:w16sdtdh="http://schemas.microsoft.com/office/word/2020/wordml/sdtdatahash" xmlns:w16sdtfl="http://schemas.microsoft.com/office/word/2024/wordml/sdtformatlock" xmlns:w16se="http://schemas.microsoft.com/office/word/2015/wordml/symex" xmlns:wpg="http://schemas.microsoft.com/office/word/2010/wordprocessingGroup" xmlns:wpi="http://schemas.microsoft.com/office/word/2010/wordprocessingInk" xmlns:wne="http://schemas.microsoft.com/office/word/2006/wordml" xmlns:wps="http://schemas.microsoft.com/office/word/2010/wordprocessingShape" mc:Ignorable="w14 w15 w16se w16cid w16 w16cex w16sdtdh w16sdtfl w16du wp14">
   <w:body>
     <w:p>
       <w:pPr>
-        <w:pStyle w:val="Titre"/>
+        <w:pStyle w:val="Title"/>
       </w:pPr>
       <w:r>
         <w:t>Manuscript instructions</w:t>
@@ -12,7 +12,10 @@
     </w:p>
     <w:p>
       <w:r>
-        <w:t>June 17, 2019.</w:t>
+        <w:t>December 2025</w:t>
+      </w:r>
+      <w:r>
+        <w:t>.</w:t>
       </w:r>
     </w:p>
     <w:p/>
@@ -40,7 +43,7 @@
     </w:p>
     <w:p>
       <w:pPr>
-        <w:pStyle w:val="Titre1"/>
+        <w:pStyle w:val="Heading1"/>
       </w:pPr>
       <w:r>
         <w:t>Introduction</w:t>
@@ -49,15 +52,7 @@
     <w:p/>
     <w:p>
       <w:r>
-        <w:t xml:space="preserve">If you give any type talk, present a poster, organize a demo booth, or organise a </w:t>
-      </w:r>
-      <w:proofErr w:type="spellStart"/>
-      <w:r>
-        <w:t>BoF</w:t>
-      </w:r>
-      <w:proofErr w:type="spellEnd"/>
-      <w:r>
-        <w:t>, at ADASS you are expected to submit a paper for the proceedings.</w:t>
+        <w:t>If you give any type talk, present a poster, organize a demo booth, or organise a BoF, at ADASS you are expected to submit a paper for the proceedings.</w:t>
       </w:r>
       <w:r>
         <w:rPr>
@@ -105,7 +100,19 @@
         <w:t>, and must follow the proper ASP style files.</w:t>
       </w:r>
       <w:r>
-        <w:t xml:space="preserve"> For ADASS XXIX, the main LaTeX style file is asp2014.sty and the </w:t>
+        <w:t xml:space="preserve"> For ADASS XX</w:t>
+      </w:r>
+      <w:r>
+        <w:t>XV</w:t>
+      </w:r>
+      <w:r>
+        <w:t>, the main LaTeX style file is asp20</w:t>
+      </w:r>
+      <w:r>
+        <w:t>21</w:t>
+      </w:r>
+      <w:r>
+        <w:t xml:space="preserve">.sty and the </w:t>
       </w:r>
       <w:proofErr w:type="spellStart"/>
       <w:r>
@@ -113,7 +120,13 @@
       </w:r>
       <w:proofErr w:type="spellEnd"/>
       <w:r>
-        <w:t xml:space="preserve"> bibliographic style file is asp2014.bst. On the ADASS site there is a .tar file</w:t>
+        <w:t xml:space="preserve"> bibliographic style file is asp20</w:t>
+      </w:r>
+      <w:r>
+        <w:t>21</w:t>
+      </w:r>
+      <w:r>
+        <w:t>.bst. On the ADASS site there is a .tar file</w:t>
       </w:r>
       <w:r>
         <w:rPr>
@@ -166,7 +179,11 @@
     <w:p/>
     <w:p>
       <w:r>
-        <w:t>The following check list is intended to serve as a basic summary of what is required. Even if you are an experienced author of ADASS papers, please do read through it, because some things have changed over time. And in any case experience shows that even the most experienced and careful authors can get some of these things wrong. The ADASS editors for this conference will check your paper, and may be able to correct minor problems, but will ask you to modify it if necessary. Editing and checking papers can be a very time-consuming process, but it goes much, much faster if authors follow the guidelines!</w:t>
+        <w:t xml:space="preserve">The following check list is intended to serve as a basic summary of what is required. Even if you are an experienced author of ADASS papers, please do read </w:t>
+      </w:r>
+      <w:r>
+        <w:lastRenderedPageBreak/>
+        <w:t>through it, because some things have changed over time. And in any case experience shows that even the most experienced and careful authors can get some of these things wrong. The ADASS editors for this conference will check your paper, and may be able to correct minor problems, but will ask you to modify it if necessary. Editing and checking papers can be a very time-consuming process, but it goes much, much faster if authors follow the guidelines!</w:t>
       </w:r>
     </w:p>
     <w:p/>
@@ -177,7 +194,7 @@
     </w:p>
     <w:p>
       <w:pPr>
-        <w:pStyle w:val="Titre1"/>
+        <w:pStyle w:val="Heading1"/>
       </w:pPr>
       <w:r>
         <w:t>Check list</w:t>
@@ -186,7 +203,7 @@
     <w:p/>
     <w:p>
       <w:pPr>
-        <w:pStyle w:val="Paragraphedeliste"/>
+        <w:pStyle w:val="ListParagraph"/>
         <w:numPr>
           <w:ilvl w:val="0"/>
           <w:numId w:val="1"/>
@@ -221,6 +238,9 @@
         <w:fldChar w:fldCharType="separate"/>
       </w:r>
       <w:r>
+        <w:rPr>
+          <w:noProof/>
+        </w:rPr>
         <w:t>7</w:t>
       </w:r>
       <w:r>
@@ -232,12 +252,12 @@
     </w:p>
     <w:p>
       <w:pPr>
-        <w:pStyle w:val="Paragraphedeliste"/>
-      </w:pPr>
-    </w:p>
-    <w:p>
-      <w:pPr>
-        <w:pStyle w:val="Paragraphedeliste"/>
+        <w:pStyle w:val="ListParagraph"/>
+      </w:pPr>
+    </w:p>
+    <w:p>
+      <w:pPr>
+        <w:pStyle w:val="ListParagraph"/>
         <w:numPr>
           <w:ilvl w:val="0"/>
           <w:numId w:val="1"/>
@@ -272,6 +292,9 @@
         <w:fldChar w:fldCharType="separate"/>
       </w:r>
       <w:r>
+        <w:rPr>
+          <w:noProof/>
+        </w:rPr>
         <w:t>5</w:t>
       </w:r>
       <w:r>
@@ -284,7 +307,7 @@
     <w:p/>
     <w:p>
       <w:pPr>
-        <w:pStyle w:val="Paragraphedeliste"/>
+        <w:pStyle w:val="ListParagraph"/>
         <w:numPr>
           <w:ilvl w:val="0"/>
           <w:numId w:val="1"/>
@@ -319,6 +342,9 @@
         <w:fldChar w:fldCharType="separate"/>
       </w:r>
       <w:r>
+        <w:rPr>
+          <w:noProof/>
+        </w:rPr>
         <w:t>5</w:t>
       </w:r>
       <w:r>
@@ -331,7 +357,7 @@
     <w:p/>
     <w:p>
       <w:pPr>
-        <w:pStyle w:val="Paragraphedeliste"/>
+        <w:pStyle w:val="ListParagraph"/>
         <w:numPr>
           <w:ilvl w:val="0"/>
           <w:numId w:val="1"/>
@@ -358,7 +384,10 @@
         <w:fldChar w:fldCharType="separate"/>
       </w:r>
       <w:r>
-        <w:t>10</w:t>
+        <w:rPr>
+          <w:noProof/>
+        </w:rPr>
+        <w:t>11</w:t>
       </w:r>
       <w:r>
         <w:fldChar w:fldCharType="end"/>
@@ -370,7 +399,7 @@
     <w:p/>
     <w:p>
       <w:pPr>
-        <w:pStyle w:val="Paragraphedeliste"/>
+        <w:pStyle w:val="ListParagraph"/>
         <w:numPr>
           <w:ilvl w:val="0"/>
           <w:numId w:val="1"/>
@@ -393,7 +422,13 @@
       </w:r>
       <w:proofErr w:type="spellEnd"/>
       <w:r>
-        <w:t>{asp2014}. (See LaTeX packages and commands, p</w:t>
+        <w:t>{asp20</w:t>
+      </w:r>
+      <w:r>
+        <w:t>21</w:t>
+      </w:r>
+      <w:r>
+        <w:t>}. (See LaTeX packages and commands, p</w:t>
       </w:r>
       <w:r>
         <w:fldChar w:fldCharType="begin"/>
@@ -405,7 +440,10 @@
         <w:fldChar w:fldCharType="separate"/>
       </w:r>
       <w:r>
-        <w:t>14</w:t>
+        <w:rPr>
+          <w:noProof/>
+        </w:rPr>
+        <w:t>15</w:t>
       </w:r>
       <w:r>
         <w:fldChar w:fldCharType="end"/>
@@ -417,7 +455,7 @@
     <w:p/>
     <w:p>
       <w:pPr>
-        <w:pStyle w:val="Paragraphedeliste"/>
+        <w:pStyle w:val="ListParagraph"/>
         <w:numPr>
           <w:ilvl w:val="0"/>
           <w:numId w:val="1"/>
@@ -452,7 +490,10 @@
         <w:fldChar w:fldCharType="separate"/>
       </w:r>
       <w:r>
-        <w:t>14</w:t>
+        <w:rPr>
+          <w:noProof/>
+        </w:rPr>
+        <w:t>15</w:t>
       </w:r>
       <w:r>
         <w:fldChar w:fldCharType="end"/>
@@ -464,7 +505,7 @@
     <w:p/>
     <w:p>
       <w:pPr>
-        <w:pStyle w:val="Paragraphedeliste"/>
+        <w:pStyle w:val="ListParagraph"/>
         <w:numPr>
           <w:ilvl w:val="0"/>
           <w:numId w:val="1"/>
@@ -491,6 +532,9 @@
         <w:fldChar w:fldCharType="separate"/>
       </w:r>
       <w:r>
+        <w:rPr>
+          <w:noProof/>
+        </w:rPr>
         <w:t>5</w:t>
       </w:r>
       <w:r>
@@ -503,7 +547,7 @@
     <w:p/>
     <w:p>
       <w:pPr>
-        <w:pStyle w:val="Paragraphedeliste"/>
+        <w:pStyle w:val="ListParagraph"/>
         <w:numPr>
           <w:ilvl w:val="0"/>
           <w:numId w:val="1"/>
@@ -530,6 +574,9 @@
         <w:fldChar w:fldCharType="separate"/>
       </w:r>
       <w:r>
+        <w:rPr>
+          <w:noProof/>
+        </w:rPr>
         <w:t>5</w:t>
       </w:r>
       <w:r>
@@ -542,7 +589,7 @@
     <w:p/>
     <w:p>
       <w:pPr>
-        <w:pStyle w:val="Paragraphedeliste"/>
+        <w:pStyle w:val="ListParagraph"/>
         <w:numPr>
           <w:ilvl w:val="0"/>
           <w:numId w:val="1"/>
@@ -561,7 +608,10 @@
         <w:fldChar w:fldCharType="separate"/>
       </w:r>
       <w:r>
-        <w:t>10</w:t>
+        <w:rPr>
+          <w:noProof/>
+        </w:rPr>
+        <w:t>11</w:t>
       </w:r>
       <w:r>
         <w:fldChar w:fldCharType="end"/>
@@ -573,7 +623,7 @@
     <w:p/>
     <w:p>
       <w:pPr>
-        <w:pStyle w:val="Paragraphedeliste"/>
+        <w:pStyle w:val="ListParagraph"/>
         <w:numPr>
           <w:ilvl w:val="0"/>
           <w:numId w:val="1"/>
@@ -592,7 +642,10 @@
         <w:fldChar w:fldCharType="separate"/>
       </w:r>
       <w:r>
-        <w:t>13</w:t>
+        <w:rPr>
+          <w:noProof/>
+        </w:rPr>
+        <w:t>14</w:t>
       </w:r>
       <w:r>
         <w:fldChar w:fldCharType="end"/>
@@ -604,13 +657,14 @@
     <w:p/>
     <w:p>
       <w:pPr>
-        <w:pStyle w:val="Paragraphedeliste"/>
+        <w:pStyle w:val="ListParagraph"/>
         <w:numPr>
           <w:ilvl w:val="0"/>
           <w:numId w:val="1"/>
         </w:numPr>
       </w:pPr>
       <w:r>
+        <w:lastRenderedPageBreak/>
         <w:t>Paper has an abstract. (See Length of Paper, p</w:t>
       </w:r>
       <w:r>
@@ -623,7 +677,10 @@
         <w:fldChar w:fldCharType="separate"/>
       </w:r>
       <w:r>
-        <w:t>13</w:t>
+        <w:rPr>
+          <w:noProof/>
+        </w:rPr>
+        <w:t>14</w:t>
       </w:r>
       <w:r>
         <w:fldChar w:fldCharType="end"/>
@@ -635,7 +692,7 @@
     <w:p/>
     <w:p>
       <w:pPr>
-        <w:pStyle w:val="Paragraphedeliste"/>
+        <w:pStyle w:val="ListParagraph"/>
         <w:numPr>
           <w:ilvl w:val="0"/>
           <w:numId w:val="1"/>
@@ -654,6 +711,9 @@
         <w:fldChar w:fldCharType="separate"/>
       </w:r>
       <w:r>
+        <w:rPr>
+          <w:noProof/>
+        </w:rPr>
         <w:t>5</w:t>
       </w:r>
       <w:r>
@@ -666,22 +726,40 @@
     <w:p/>
     <w:p>
       <w:pPr>
-        <w:pStyle w:val="Paragraphedeliste"/>
+        <w:pStyle w:val="ListParagraph"/>
         <w:numPr>
           <w:ilvl w:val="0"/>
           <w:numId w:val="1"/>
         </w:numPr>
       </w:pPr>
       <w:r>
-        <w:t xml:space="preserve">Graphics files have to be .eps encapsulated Postscript format. </w:t>
-      </w:r>
-      <w:proofErr w:type="gramStart"/>
-      <w:r>
-        <w:t>Yes</w:t>
-      </w:r>
-      <w:proofErr w:type="gramEnd"/>
-      <w:r>
-        <w:t xml:space="preserve"> they do! Sorry, but they do. (See Figures – format, p</w:t>
+        <w:t xml:space="preserve">Graphics files </w:t>
+      </w:r>
+      <w:r>
+        <w:t xml:space="preserve">must </w:t>
+      </w:r>
+      <w:r>
+        <w:t>be</w:t>
+      </w:r>
+      <w:r>
+        <w:t xml:space="preserve"> either JPEG or PNG format, with .jpg or .</w:t>
+      </w:r>
+      <w:proofErr w:type="spellStart"/>
+      <w:r>
+        <w:t>png</w:t>
+      </w:r>
+      <w:proofErr w:type="spellEnd"/>
+      <w:r>
+        <w:t xml:space="preserve"> extensions. E</w:t>
+      </w:r>
+      <w:r>
+        <w:t>ncapsulated Postscript format</w:t>
+      </w:r>
+      <w:r>
+        <w:t xml:space="preserve"> .eps files can no longer be used</w:t>
+      </w:r>
+      <w:r>
+        <w:t>. (See Figures – format, p</w:t>
       </w:r>
       <w:r>
         <w:fldChar w:fldCharType="begin"/>
@@ -693,7 +771,10 @@
         <w:fldChar w:fldCharType="separate"/>
       </w:r>
       <w:r>
-        <w:t>10</w:t>
+        <w:rPr>
+          <w:noProof/>
+        </w:rPr>
+        <w:t>11</w:t>
       </w:r>
       <w:r>
         <w:fldChar w:fldCharType="end"/>
@@ -705,14 +786,25 @@
     <w:p/>
     <w:p>
       <w:pPr>
-        <w:pStyle w:val="Paragraphedeliste"/>
+        <w:pStyle w:val="ListParagraph"/>
         <w:numPr>
           <w:ilvl w:val="0"/>
           <w:numId w:val="1"/>
         </w:numPr>
       </w:pPr>
       <w:r>
-        <w:t xml:space="preserve">Name all the files properly - figures are &lt;paper&gt;_f&lt;n&gt;.eps, </w:t>
+        <w:t>Name all the files properly - figures are &lt;paper&gt;_f&lt;n&gt;.</w:t>
+      </w:r>
+      <w:r>
+        <w:t>jpg or .</w:t>
+      </w:r>
+      <w:proofErr w:type="spellStart"/>
+      <w:r>
+        <w:t>png</w:t>
+      </w:r>
+      <w:proofErr w:type="spellEnd"/>
+      <w:r>
+        <w:t xml:space="preserve">, </w:t>
       </w:r>
       <w:proofErr w:type="spellStart"/>
       <w:r>
@@ -720,7 +812,13 @@
       </w:r>
       <w:proofErr w:type="spellEnd"/>
       <w:r>
-        <w:t xml:space="preserve"> O1-3_f1.eps. Paper names use dashes not periods, O1-3.tex not O1.3.tex. Posters now use the same naming convention as oral papers, e.g. P3-21. All files should be in the same directory – don’t use a separate sub-directory for graphics files. (See File names and Paper IDs, p</w:t>
+        <w:t xml:space="preserve"> O1-3_f1.</w:t>
+      </w:r>
+      <w:r>
+        <w:t>jpg</w:t>
+      </w:r>
+      <w:r>
+        <w:t>. Paper names use dashes not periods, O1-3.tex not O1.3.tex. Posters now use the same naming convention as oral papers, e.g. P3-21. All files should be in the same directory – don’t use a separate sub-directory for graphics files. (See File names and Paper IDs, p</w:t>
       </w:r>
       <w:r>
         <w:fldChar w:fldCharType="begin"/>
@@ -732,6 +830,9 @@
         <w:fldChar w:fldCharType="separate"/>
       </w:r>
       <w:r>
+        <w:rPr>
+          <w:noProof/>
+        </w:rPr>
         <w:t>7</w:t>
       </w:r>
       <w:r>
@@ -744,7 +845,7 @@
     <w:p/>
     <w:p>
       <w:pPr>
-        <w:pStyle w:val="Paragraphedeliste"/>
+        <w:pStyle w:val="ListParagraph"/>
         <w:numPr>
           <w:ilvl w:val="0"/>
           <w:numId w:val="1"/>
@@ -763,7 +864,10 @@
         <w:fldChar w:fldCharType="separate"/>
       </w:r>
       <w:r>
-        <w:t>8</w:t>
+        <w:rPr>
+          <w:noProof/>
+        </w:rPr>
+        <w:t>10</w:t>
       </w:r>
       <w:r>
         <w:fldChar w:fldCharType="end"/>
@@ -775,7 +879,7 @@
     <w:p/>
     <w:p>
       <w:pPr>
-        <w:pStyle w:val="Paragraphedeliste"/>
+        <w:pStyle w:val="ListParagraph"/>
         <w:numPr>
           <w:ilvl w:val="0"/>
           <w:numId w:val="1"/>
@@ -794,7 +898,10 @@
         <w:fldChar w:fldCharType="separate"/>
       </w:r>
       <w:r>
-        <w:t>8</w:t>
+        <w:rPr>
+          <w:noProof/>
+        </w:rPr>
+        <w:t>10</w:t>
       </w:r>
       <w:r>
         <w:fldChar w:fldCharType="end"/>
@@ -806,7 +913,7 @@
     <w:p/>
     <w:p>
       <w:pPr>
-        <w:pStyle w:val="Paragraphedeliste"/>
+        <w:pStyle w:val="ListParagraph"/>
         <w:numPr>
           <w:ilvl w:val="0"/>
           <w:numId w:val="1"/>
@@ -841,7 +948,10 @@
         <w:fldChar w:fldCharType="separate"/>
       </w:r>
       <w:r>
-        <w:t>10</w:t>
+        <w:rPr>
+          <w:noProof/>
+        </w:rPr>
+        <w:t>11</w:t>
       </w:r>
       <w:r>
         <w:fldChar w:fldCharType="end"/>
@@ -853,7 +963,7 @@
     <w:p/>
     <w:p>
       <w:pPr>
-        <w:pStyle w:val="Paragraphedeliste"/>
+        <w:pStyle w:val="ListParagraph"/>
         <w:numPr>
           <w:ilvl w:val="0"/>
           <w:numId w:val="1"/>
@@ -872,7 +982,10 @@
         <w:fldChar w:fldCharType="separate"/>
       </w:r>
       <w:r>
-        <w:t>16</w:t>
+        <w:rPr>
+          <w:noProof/>
+        </w:rPr>
+        <w:t>18</w:t>
       </w:r>
       <w:r>
         <w:fldChar w:fldCharType="end"/>
@@ -884,7 +997,7 @@
     <w:p/>
     <w:p>
       <w:pPr>
-        <w:pStyle w:val="Paragraphedeliste"/>
+        <w:pStyle w:val="ListParagraph"/>
         <w:numPr>
           <w:ilvl w:val="0"/>
           <w:numId w:val="1"/>
@@ -903,7 +1016,10 @@
         <w:fldChar w:fldCharType="separate"/>
       </w:r>
       <w:r>
-        <w:t>11</w:t>
+        <w:rPr>
+          <w:noProof/>
+        </w:rPr>
+        <w:t>12</w:t>
       </w:r>
       <w:r>
         <w:fldChar w:fldCharType="end"/>
@@ -915,7 +1031,7 @@
     <w:p/>
     <w:p>
       <w:pPr>
-        <w:pStyle w:val="Paragraphedeliste"/>
+        <w:pStyle w:val="ListParagraph"/>
         <w:numPr>
           <w:ilvl w:val="0"/>
           <w:numId w:val="1"/>
@@ -934,7 +1050,10 @@
         <w:fldChar w:fldCharType="separate"/>
       </w:r>
       <w:r>
-        <w:t>11</w:t>
+        <w:rPr>
+          <w:noProof/>
+        </w:rPr>
+        <w:t>12</w:t>
       </w:r>
       <w:r>
         <w:fldChar w:fldCharType="end"/>
@@ -946,7 +1065,7 @@
     <w:p/>
     <w:p>
       <w:pPr>
-        <w:pStyle w:val="Paragraphedeliste"/>
+        <w:pStyle w:val="ListParagraph"/>
         <w:numPr>
           <w:ilvl w:val="0"/>
           <w:numId w:val="1"/>
@@ -965,7 +1084,10 @@
         <w:fldChar w:fldCharType="separate"/>
       </w:r>
       <w:r>
-        <w:t>11</w:t>
+        <w:rPr>
+          <w:noProof/>
+        </w:rPr>
+        <w:t>12</w:t>
       </w:r>
       <w:r>
         <w:fldChar w:fldCharType="end"/>
@@ -977,7 +1099,7 @@
     <w:p/>
     <w:p>
       <w:pPr>
-        <w:pStyle w:val="Paragraphedeliste"/>
+        <w:pStyle w:val="ListParagraph"/>
         <w:numPr>
           <w:ilvl w:val="0"/>
           <w:numId w:val="1"/>
@@ -996,7 +1118,10 @@
         <w:fldChar w:fldCharType="separate"/>
       </w:r>
       <w:r>
-        <w:t>10</w:t>
+        <w:rPr>
+          <w:noProof/>
+        </w:rPr>
+        <w:t>11</w:t>
       </w:r>
       <w:r>
         <w:fldChar w:fldCharType="end"/>
@@ -1008,7 +1133,7 @@
     <w:p/>
     <w:p>
       <w:pPr>
-        <w:pStyle w:val="Paragraphedeliste"/>
+        <w:pStyle w:val="ListParagraph"/>
         <w:numPr>
           <w:ilvl w:val="0"/>
           <w:numId w:val="1"/>
@@ -1027,7 +1152,10 @@
         <w:fldChar w:fldCharType="separate"/>
       </w:r>
       <w:r>
-        <w:t>15</w:t>
+        <w:rPr>
+          <w:noProof/>
+        </w:rPr>
+        <w:t>16</w:t>
       </w:r>
       <w:r>
         <w:fldChar w:fldCharType="end"/>
@@ -1039,7 +1167,7 @@
     <w:p/>
     <w:p>
       <w:pPr>
-        <w:pStyle w:val="Paragraphedeliste"/>
+        <w:pStyle w:val="ListParagraph"/>
         <w:numPr>
           <w:ilvl w:val="0"/>
           <w:numId w:val="1"/>
@@ -1054,7 +1182,11 @@
       </w:r>
       <w:proofErr w:type="spellEnd"/>
       <w:r>
-        <w:t>') in places where other languages, particularly Eastern European languages, don't have them. (See Content and Typesetting, p</w:t>
+        <w:t xml:space="preserve">') in places where other languages, particularly </w:t>
+      </w:r>
+      <w:r>
+        <w:lastRenderedPageBreak/>
+        <w:t>Eastern European languages, don't have them. (See Content and Typesetting, p</w:t>
       </w:r>
       <w:r>
         <w:fldChar w:fldCharType="begin"/>
@@ -1066,7 +1198,10 @@
         <w:fldChar w:fldCharType="separate"/>
       </w:r>
       <w:r>
-        <w:t>15</w:t>
+        <w:rPr>
+          <w:noProof/>
+        </w:rPr>
+        <w:t>16</w:t>
       </w:r>
       <w:r>
         <w:fldChar w:fldCharType="end"/>
@@ -1078,7 +1213,7 @@
     <w:p/>
     <w:p>
       <w:pPr>
-        <w:pStyle w:val="Paragraphedeliste"/>
+        <w:pStyle w:val="ListParagraph"/>
         <w:numPr>
           <w:ilvl w:val="0"/>
           <w:numId w:val="1"/>
@@ -1105,7 +1240,10 @@
         <w:fldChar w:fldCharType="separate"/>
       </w:r>
       <w:r>
-        <w:t>11</w:t>
+        <w:rPr>
+          <w:noProof/>
+        </w:rPr>
+        <w:t>12</w:t>
       </w:r>
       <w:r>
         <w:fldChar w:fldCharType="end"/>
@@ -1123,7 +1261,10 @@
         <w:fldChar w:fldCharType="separate"/>
       </w:r>
       <w:r>
-        <w:t>19</w:t>
+        <w:rPr>
+          <w:noProof/>
+        </w:rPr>
+        <w:t>20</w:t>
       </w:r>
       <w:r>
         <w:fldChar w:fldCharType="end"/>
@@ -1149,11 +1290,12 @@
     </w:p>
     <w:p>
       <w:pPr>
-        <w:pStyle w:val="Titre1"/>
+        <w:pStyle w:val="Heading1"/>
       </w:pPr>
       <w:bookmarkStart w:id="0" w:name="_Ref493090355"/>
       <w:bookmarkEnd w:id="0"/>
       <w:r>
+        <w:lastRenderedPageBreak/>
         <w:t>References</w:t>
       </w:r>
     </w:p>
@@ -1467,66 +1609,74 @@
         <w:t xml:space="preserve">   {</w:t>
       </w:r>
       <w:proofErr w:type="spellStart"/>
-      <w:proofErr w:type="gramEnd"/>
       <w:r>
         <w:rPr>
           <w:rFonts w:ascii="Courier" w:hAnsi="Courier"/>
           <w:sz w:val="20"/>
           <w:szCs w:val="20"/>
         </w:rPr>
-        <w:t>arXiv:nnnn.mmmmm</w:t>
-      </w:r>
-      <w:proofErr w:type="spellEnd"/>
+        <w:t>arXiv:nnnn</w:t>
+      </w:r>
+      <w:proofErr w:type="gramEnd"/>
       <w:r>
         <w:rPr>
           <w:rFonts w:ascii="Courier" w:hAnsi="Courier"/>
           <w:sz w:val="20"/>
           <w:szCs w:val="20"/>
         </w:rPr>
-        <w:t>},</w:t>
-      </w:r>
-    </w:p>
-    <w:p>
-      <w:pPr>
+        <w:t>.mmmmm</w:t>
+      </w:r>
+      <w:proofErr w:type="spellEnd"/>
+      <w:r>
         <w:rPr>
           <w:rFonts w:ascii="Courier" w:hAnsi="Courier"/>
           <w:sz w:val="20"/>
           <w:szCs w:val="20"/>
         </w:rPr>
-      </w:pPr>
-      <w:r>
+        <w:t>},</w:t>
+      </w:r>
+    </w:p>
+    <w:p>
+      <w:pPr>
         <w:rPr>
           <w:rFonts w:ascii="Courier" w:hAnsi="Courier"/>
           <w:sz w:val="20"/>
           <w:szCs w:val="20"/>
         </w:rPr>
-        <w:t xml:space="preserve">  year =         20yy,</w:t>
-      </w:r>
-    </w:p>
-    <w:p>
-      <w:pPr>
+      </w:pPr>
+      <w:r>
         <w:rPr>
           <w:rFonts w:ascii="Courier" w:hAnsi="Courier"/>
           <w:sz w:val="20"/>
           <w:szCs w:val="20"/>
         </w:rPr>
-      </w:pPr>
-      <w:r>
+        <w:t xml:space="preserve">  year =         20yy,</w:t>
+      </w:r>
+    </w:p>
+    <w:p>
+      <w:pPr>
         <w:rPr>
           <w:rFonts w:ascii="Courier" w:hAnsi="Courier"/>
           <w:sz w:val="20"/>
           <w:szCs w:val="20"/>
         </w:rPr>
-        <w:t>}</w:t>
-      </w:r>
-    </w:p>
-    <w:p>
-      <w:pPr>
+      </w:pPr>
+      <w:r>
         <w:rPr>
           <w:rFonts w:ascii="Courier" w:hAnsi="Courier"/>
           <w:sz w:val="20"/>
           <w:szCs w:val="20"/>
         </w:rPr>
+        <w:t>}</w:t>
+      </w:r>
+    </w:p>
+    <w:p>
+      <w:pPr>
+        <w:rPr>
+          <w:rFonts w:ascii="Courier" w:hAnsi="Courier"/>
+          <w:sz w:val="20"/>
+          <w:szCs w:val="20"/>
+        </w:rPr>
       </w:pPr>
     </w:p>
     <w:p>
@@ -1582,7 +1732,11 @@
       </w:r>
       <w:proofErr w:type="spellEnd"/>
       <w:r>
-        <w:t xml:space="preserve"> entry should be “{Author}, A.~N. and others”.  Note that this applies to lists of editors as well, although having more than eight editors is unusual. Also, ADS makes ADASS references particularly verbose, calling the series “Astronomical Society of the Pacific Conference Series” which you can replace with “ASP Conf. Ser.”, and the ADASS book titles “Astronomical Data Analysis Software and Systems XXI” etc., which you can replace with “ADASS XXI”. </w:t>
+        <w:t xml:space="preserve"> entry should be “{Author}, A.~N. and others”.  Note </w:t>
+      </w:r>
+      <w:r>
+        <w:lastRenderedPageBreak/>
+        <w:t xml:space="preserve">that this applies to lists of editors as well, although having more than eight editors is unusual. Also, ADS makes ADASS references particularly verbose, calling the series “Astronomical Society of the Pacific Conference Series” which you can replace with “ASP Conf. Ser.”, and the ADASS book titles “Astronomical Data Analysis Software and Systems XXI” etc., which you can replace with “ADASS XXI”. </w:t>
       </w:r>
     </w:p>
     <w:p/>
@@ -1614,7 +1768,13 @@
         <w:rPr>
           <w:rFonts w:ascii="Courier" w:hAnsi="Courier"/>
         </w:rPr>
-        <w:t>xix</w:t>
+        <w:t>x</w:t>
+      </w:r>
+      <w:r>
+        <w:rPr>
+          <w:rFonts w:ascii="Courier" w:hAnsi="Courier"/>
+        </w:rPr>
+        <w:t>xv</w:t>
       </w:r>
       <w:r>
         <w:rPr>
@@ -1666,7 +1826,13 @@
         <w:rPr>
           <w:rFonts w:ascii="Courier" w:hAnsi="Courier"/>
         </w:rPr>
-        <w:t>XIX</w:t>
+        <w:t>X</w:t>
+      </w:r>
+      <w:r>
+        <w:rPr>
+          <w:rFonts w:ascii="Courier" w:hAnsi="Courier"/>
+        </w:rPr>
+        <w:t>XV</w:t>
       </w:r>
       <w:r>
         <w:rPr>
@@ -1691,7 +1857,13 @@
         <w:rPr>
           <w:rFonts w:ascii="Courier" w:hAnsi="Courier"/>
         </w:rPr>
-        <w:t>20</w:t>
+        <w:t>2</w:t>
+      </w:r>
+      <w:r>
+        <w:rPr>
+          <w:rFonts w:ascii="Courier" w:hAnsi="Courier"/>
+        </w:rPr>
+        <w:t>6</w:t>
       </w:r>
       <w:r>
         <w:rPr>
@@ -1816,19 +1988,28 @@
         <w:t>(This is for ADASS XX</w:t>
       </w:r>
       <w:r>
-        <w:t>IX</w:t>
+        <w:t>XV</w:t>
       </w:r>
       <w:r>
         <w:t xml:space="preserve"> in </w:t>
       </w:r>
       <w:r>
-        <w:t>Groningen, The Netherlands</w:t>
-      </w:r>
-      <w:r>
-        <w:t>, 201</w:t>
-      </w:r>
-      <w:r>
-        <w:t>9</w:t>
+        <w:t>G</w:t>
+      </w:r>
+      <w:r>
+        <w:t>örlitz</w:t>
+      </w:r>
+      <w:r>
+        <w:t xml:space="preserve">, </w:t>
+      </w:r>
+      <w:r>
+        <w:t>Germany</w:t>
+      </w:r>
+      <w:r>
+        <w:t>, 20</w:t>
+      </w:r>
+      <w:r>
+        <w:t>25</w:t>
       </w:r>
       <w:r>
         <w:t>. For later meetings change the roman numerals – in both places – and the year. Note that the proceedings will be published the year after the conference.) The ADASS editors will fill in the various TBDs as part of the process of completing the volume. For the &lt;</w:t>
@@ -1845,15 +2026,7 @@
     <w:p/>
     <w:p>
       <w:r>
-        <w:t>It is never correct to list more than one author followed by et al. You should never have an entry like author = {{Author}, A.~N. and {</w:t>
-      </w:r>
-      <w:proofErr w:type="spellStart"/>
-      <w:r>
-        <w:t>Coauthor</w:t>
-      </w:r>
-      <w:proofErr w:type="spellEnd"/>
-      <w:r>
-        <w:t xml:space="preserve">}, B.~M. and others} in the </w:t>
+        <w:t xml:space="preserve">It is never correct to list more than one author followed by et al. You should never have an entry like author = {{Author}, A.~N. and {Coauthor}, B.~M. and others} in the </w:t>
       </w:r>
       <w:proofErr w:type="spellStart"/>
       <w:r>
@@ -1900,6 +2073,7 @@
     <w:p/>
     <w:p>
       <w:r>
+        <w:lastRenderedPageBreak/>
         <w:t>LaTeX supports a number of ‘\cite’-type commands, but most of what you need can be accommodated by \</w:t>
       </w:r>
       <w:proofErr w:type="spellStart"/>
@@ -2104,7 +2278,7 @@
     <w:p/>
     <w:p>
       <w:pPr>
-        <w:pStyle w:val="Titre1"/>
+        <w:pStyle w:val="Heading1"/>
       </w:pPr>
       <w:bookmarkStart w:id="1" w:name="_Ref493090265"/>
       <w:bookmarkEnd w:id="1"/>
@@ -2136,13 +2310,8 @@
       </w:r>
     </w:p>
     <w:p>
-      <w:proofErr w:type="spellStart"/>
-      <w:r>
-        <w:t>BoF</w:t>
-      </w:r>
-      <w:proofErr w:type="spellEnd"/>
-      <w:r>
-        <w:t>: B</w:t>
+      <w:r>
+        <w:t>BoF: B</w:t>
       </w:r>
     </w:p>
     <w:p>
@@ -2225,7 +2394,32 @@
       </w:r>
       <w:proofErr w:type="spellEnd"/>
       <w:r>
-        <w:t>&gt;_f&lt;n&gt;.eps, where &lt;n&gt; is the figure number, starting at 1.</w:t>
+        <w:t>&gt;_f&lt;n&gt;.</w:t>
+      </w:r>
+      <w:r>
+        <w:t xml:space="preserve">jpg or </w:t>
+      </w:r>
+      <w:r>
+        <w:t>&lt;</w:t>
+      </w:r>
+      <w:proofErr w:type="spellStart"/>
+      <w:r>
+        <w:t>paper_id</w:t>
+      </w:r>
+      <w:proofErr w:type="spellEnd"/>
+      <w:r>
+        <w:t>&gt;_f&lt;n&gt;.</w:t>
+      </w:r>
+      <w:proofErr w:type="spellStart"/>
+      <w:r>
+        <w:t>png</w:t>
+      </w:r>
+      <w:proofErr w:type="spellEnd"/>
+      <w:r>
+        <w:t xml:space="preserve"> </w:t>
+      </w:r>
+      <w:r>
+        <w:t>where &lt;n&gt; is the figure number, starting at 1.</w:t>
       </w:r>
     </w:p>
     <w:p/>
@@ -2294,7 +2488,13 @@
           <w:lang w:val="pt-BR"/>
         </w:rPr>
         <w:tab/>
-        <w:t>O4-3.tex, O4-3.bib, O4-3_f1.eps</w:t>
+        <w:t>O4-3.tex, O4-3.bib, O4-3_f1.</w:t>
+      </w:r>
+      <w:r>
+        <w:rPr>
+          <w:lang w:val="pt-BR"/>
+        </w:rPr>
+        <w:t>jpg</w:t>
       </w:r>
     </w:p>
     <w:p>
@@ -2303,17 +2503,15 @@
       </w:r>
       <w:r>
         <w:tab/>
-        <w:t>I3-1.tex, I3-1.bib, I3-1_f1.eps</w:t>
-      </w:r>
-    </w:p>
-    <w:p>
-      <w:proofErr w:type="spellStart"/>
-      <w:r>
-        <w:t>BoF</w:t>
-      </w:r>
-      <w:proofErr w:type="spellEnd"/>
-      <w:r>
-        <w:t xml:space="preserve"> 2</w:t>
+        <w:t>I3-1.tex, I3-1.bib, I3-1_f1.</w:t>
+      </w:r>
+      <w:r>
+        <w:t>png</w:t>
+      </w:r>
+    </w:p>
+    <w:p>
+      <w:r>
+        <w:t>BoF 2</w:t>
       </w:r>
       <w:r>
         <w:tab/>
@@ -2326,7 +2524,10 @@
       </w:r>
       <w:r>
         <w:tab/>
-        <w:t>B2.tex, B2.bib, B2_f1.eps</w:t>
+        <w:t>B2.tex, B2.bib, B2_f1.</w:t>
+      </w:r>
+      <w:r>
+        <w:t>jpg</w:t>
       </w:r>
     </w:p>
     <w:p>
@@ -2341,7 +2542,10 @@
       </w:r>
       <w:r>
         <w:tab/>
-        <w:t>F5.tex, F5.bib, F5_f1.eps</w:t>
+        <w:t>F5.tex, F5.bib, F5_f1.</w:t>
+      </w:r>
+      <w:r>
+        <w:t>jpg</w:t>
       </w:r>
     </w:p>
     <w:p>
@@ -2356,7 +2560,10 @@
       </w:r>
       <w:r>
         <w:tab/>
-        <w:t>P1-23.tex, P1-23.bib, P1-23_f1.eps</w:t>
+        <w:t>P1-23.tex, P1-23.bib, P1-23_f1.</w:t>
+      </w:r>
+      <w:r>
+        <w:t>png</w:t>
       </w:r>
     </w:p>
     <w:p>
@@ -2368,7 +2575,10 @@
       </w:r>
       <w:r>
         <w:tab/>
-        <w:t>D4.tex, D4.bib, D4_f1.eps</w:t>
+        <w:t>D4.tex, D4.bib, D4_f1.</w:t>
+      </w:r>
+      <w:r>
+        <w:t>jpg</w:t>
       </w:r>
     </w:p>
     <w:p>
@@ -2400,14 +2610,20 @@
           <w:lang w:val="fr-FR"/>
         </w:rPr>
         <w:tab/>
-        <w:t>T2.tex, T2.bib, T2_f1.eps</w:t>
-      </w:r>
-    </w:p>
-    <w:p>
-      <w:pPr>
+        <w:t>T2.tex, T2.bib, T2_f1.</w:t>
+      </w:r>
+      <w:r>
         <w:rPr>
           <w:lang w:val="fr-FR"/>
         </w:rPr>
+        <w:t>jpg</w:t>
+      </w:r>
+    </w:p>
+    <w:p>
+      <w:pPr>
+        <w:rPr>
+          <w:lang w:val="fr-FR"/>
+        </w:rPr>
       </w:pPr>
     </w:p>
     <w:p>
@@ -2420,7 +2636,18 @@
       </w:r>
       <w:proofErr w:type="spellEnd"/>
       <w:r>
-        <w:t xml:space="preserve"> file, the .bib file (unless your paper has no references) and any .eps files it uses. You should also include a copy of the .pdf file that was generated when you typeset the paper yourself. Please have all the files in the same directory, rather than using a subdirectory for associated files like figures.</w:t>
+        <w:t xml:space="preserve"> file, the .bib file (unless your paper has no references) and any .</w:t>
+      </w:r>
+      <w:r>
+        <w:t>jpg or .</w:t>
+      </w:r>
+      <w:proofErr w:type="spellStart"/>
+      <w:r>
+        <w:t>png</w:t>
+      </w:r>
+      <w:proofErr w:type="spellEnd"/>
+      <w:r>
+        <w:t xml:space="preserve"> files it uses. You should also include a copy of the .pdf file that was generated when you typeset the paper yourself. Please have all the files in the same directory, rather than using a subdirectory for associated files like figures.</w:t>
       </w:r>
     </w:p>
     <w:p/>
@@ -2495,16 +2722,18 @@
         </w:rPr>
       </w:pPr>
       <w:r>
+        <w:lastRenderedPageBreak/>
         <w:br w:type="page"/>
       </w:r>
     </w:p>
     <w:p>
       <w:pPr>
-        <w:pStyle w:val="Titre1"/>
+        <w:pStyle w:val="Heading1"/>
       </w:pPr>
       <w:bookmarkStart w:id="2" w:name="_Ref493090594"/>
       <w:bookmarkEnd w:id="2"/>
       <w:r>
+        <w:lastRenderedPageBreak/>
         <w:t>Figures - content</w:t>
       </w:r>
     </w:p>
@@ -2592,15 +2821,7 @@
       </w:r>
       <w:proofErr w:type="spellEnd"/>
       <w:r>
-        <w:t xml:space="preserve">/cm) to reproduce satisfactorily. Authors should print out their figures at actual size and evaluate the readability of any embedded text. If the embedded text appears smaller than about 8 </w:t>
-      </w:r>
-      <w:proofErr w:type="spellStart"/>
-      <w:r>
-        <w:t>pt</w:t>
-      </w:r>
-      <w:proofErr w:type="spellEnd"/>
-      <w:r>
-        <w:t>, then it is not going to be readable in the final printed figure. Text also needs to appear in a contrasting colour to be easily legible.</w:t>
+        <w:t>/cm) to reproduce satisfactorily. Authors should print out their figures at actual size and evaluate the readability of any embedded text. If the embedded text appears smaller than about 8 pt, then it is not going to be readable in the final printed figure. Text also needs to appear in a contrasting colour to be easily legible.</w:t>
       </w:r>
     </w:p>
     <w:p/>
@@ -2611,12 +2832,12 @@
     </w:p>
     <w:p>
       <w:pPr>
-        <w:pStyle w:val="Titre1"/>
-      </w:pPr>
-    </w:p>
-    <w:p>
-      <w:pPr>
-        <w:pStyle w:val="Titre1"/>
+        <w:pStyle w:val="Heading1"/>
+      </w:pPr>
+    </w:p>
+    <w:p>
+      <w:pPr>
+        <w:pStyle w:val="Heading1"/>
       </w:pPr>
       <w:bookmarkStart w:id="3" w:name="_Ref493090560"/>
       <w:bookmarkEnd w:id="3"/>
@@ -2627,41 +2848,134 @@
     <w:p/>
     <w:p>
       <w:r>
-        <w:t>Figures must be submitted as .eps (encapsulated postscript files). Unfortunately, this is an ASP requirement. We realise the originals for most figures will not be in this format, and you will have to convert them. Sorry.</w:t>
-      </w:r>
-    </w:p>
-    <w:p/>
-    <w:p>
-      <w:r>
-        <w:t xml:space="preserve">There are some very capable graphic conversion programs that can convert almost anything into a .eps file. One example for MacOS is </w:t>
-      </w:r>
-      <w:proofErr w:type="spellStart"/>
-      <w:r>
-        <w:t>GraphicConverter</w:t>
-      </w:r>
-      <w:proofErr w:type="spellEnd"/>
-      <w:r>
-        <w:t>.</w:t>
-      </w:r>
-      <w:r>
-        <w:rPr>
-          <w:rStyle w:val="FootnoteAnchor"/>
-        </w:rPr>
-        <w:footnoteReference w:id="7"/>
-      </w:r>
-      <w:r>
-        <w:t xml:space="preserve"> There are a number of Web-based converters of varying quality available. We have seen some rather strange .eps files submitted with ADASS papers in the past. It also seems that some versions of LaTeX handle strange .eps files better than others do, so the ADASS editors may not always get the same results as you do from some of the stranger files – bounding box problems in particular can make a figure look a different size on different machines.</w:t>
-      </w:r>
-    </w:p>
-    <w:p/>
-    <w:p>
-      <w:r>
-        <w:t>If you have problems with conversion to .eps, contact the ADASS editors. If you think your .eps files may give problems, it can help to submit the original files as well (but don’t expect the editors to fix all your conversion problems for you!). This is a case where submitting your version of the final .pdf file can help – the editors can at least see what you expect the figures to look like.</w:t>
-      </w:r>
-    </w:p>
-    <w:p>
-      <w:pPr>
-        <w:pStyle w:val="Titre1"/>
+        <w:t>Figures must be submitted in JPEG or PNG format, using files with .jpg or .</w:t>
+      </w:r>
+      <w:proofErr w:type="spellStart"/>
+      <w:r>
+        <w:t>png</w:t>
+      </w:r>
+      <w:proofErr w:type="spellEnd"/>
+      <w:r>
+        <w:t xml:space="preserve"> extensions.</w:t>
+      </w:r>
+    </w:p>
+    <w:p/>
+    <w:p>
+      <w:r>
+        <w:t>Up until ADASS 2025, f</w:t>
+      </w:r>
+      <w:r>
+        <w:t xml:space="preserve">igures </w:t>
+      </w:r>
+      <w:r>
+        <w:t>had to</w:t>
+      </w:r>
+      <w:r>
+        <w:t xml:space="preserve"> be submitted as .eps (encapsulated postscript files). </w:t>
+      </w:r>
+      <w:r>
+        <w:t>This was not the most convenient format for most authors, but it had been an A</w:t>
+      </w:r>
+      <w:r>
+        <w:t>SP</w:t>
+      </w:r>
+      <w:r>
+        <w:t xml:space="preserve"> requirement. From ADASS 2025, the way figures are processed has changed, and it now supports JPEG </w:t>
+      </w:r>
+      <w:r>
+        <w:t xml:space="preserve">and </w:t>
+      </w:r>
+      <w:r>
+        <w:t>PNG format files</w:t>
+      </w:r>
+      <w:r>
+        <w:t xml:space="preserve"> – and only those.</w:t>
+      </w:r>
+      <w:r>
+        <w:t xml:space="preserve"> It is possible to use both formats in the one paper; you don’t have to </w:t>
+      </w:r>
+      <w:proofErr w:type="spellStart"/>
+      <w:r>
+        <w:t>chose</w:t>
+      </w:r>
+      <w:proofErr w:type="spellEnd"/>
+      <w:r>
+        <w:t xml:space="preserve"> one format and stick to it.</w:t>
+      </w:r>
+    </w:p>
+    <w:p/>
+    <w:p>
+      <w:r>
+        <w:t xml:space="preserve">Note that the old .eps format is not supported by the new system. (If you are using packages like </w:t>
+      </w:r>
+      <w:proofErr w:type="spellStart"/>
+      <w:r>
+        <w:t>TeXShop</w:t>
+      </w:r>
+      <w:proofErr w:type="spellEnd"/>
+      <w:r>
+        <w:t xml:space="preserve"> or </w:t>
+      </w:r>
+      <w:proofErr w:type="spellStart"/>
+      <w:r>
+        <w:t>TeX</w:t>
+      </w:r>
+      <w:proofErr w:type="spellEnd"/>
+      <w:r>
+        <w:t xml:space="preserve"> Live you may find that .eps files still work for you, because these convert from .eps for you behind the scenes. However, the process now used to generate the ADASS Proceedings is different and will not work with .eps files. Bottom line: don’t submit .eps files; convert them into .</w:t>
+      </w:r>
+      <w:proofErr w:type="spellStart"/>
+      <w:r>
+        <w:t>png</w:t>
+      </w:r>
+      <w:proofErr w:type="spellEnd"/>
+      <w:r>
+        <w:t xml:space="preserve"> or .jpg using something like </w:t>
+      </w:r>
+      <w:proofErr w:type="spellStart"/>
+      <w:r>
+        <w:t>ghostscript</w:t>
+      </w:r>
+      <w:proofErr w:type="spellEnd"/>
+      <w:r>
+        <w:t xml:space="preserve"> instead.)</w:t>
+      </w:r>
+    </w:p>
+    <w:p/>
+    <w:p>
+      <w:r>
+        <w:t xml:space="preserve">If you have problems with </w:t>
+      </w:r>
+      <w:r>
+        <w:t>graphics file formats</w:t>
+      </w:r>
+      <w:r>
+        <w:t xml:space="preserve">, contact the ADASS editors. </w:t>
+      </w:r>
+      <w:r>
+        <w:t xml:space="preserve">In some </w:t>
+      </w:r>
+      <w:proofErr w:type="gramStart"/>
+      <w:r>
+        <w:t>cases</w:t>
+      </w:r>
+      <w:proofErr w:type="gramEnd"/>
+      <w:r>
+        <w:t xml:space="preserve"> s</w:t>
+      </w:r>
+      <w:r>
+        <w:t>ubmit</w:t>
+      </w:r>
+      <w:r>
+        <w:t>ting</w:t>
+      </w:r>
+      <w:r>
+        <w:t xml:space="preserve"> your version of the final .pdf file can help – the editors can at least see what you expect the figures to look like.</w:t>
+      </w:r>
+    </w:p>
+    <w:p>
+      <w:pPr>
+        <w:pStyle w:val="Heading1"/>
       </w:pPr>
       <w:bookmarkStart w:id="4" w:name="_Ref493090389"/>
       <w:bookmarkEnd w:id="4"/>
@@ -2712,7 +3026,11 @@
     <w:p/>
     <w:p>
       <w:r>
-        <w:t>Figure scales can be reduced until the figure fits properly. You may then have to see how legible it is, of course. Verbatim text is something you will have to reformat yourself – if it is program text, you may need to split the lines up. You can change the text size of verbatim text, perhaps with \small, and this may help. You can use the \- directive to show LaTeX where a word can be hyphen\-</w:t>
+        <w:t xml:space="preserve">Figure scales can be reduced until the figure fits properly. You may then have to see how legible it is, of course. Verbatim text is something you will have to </w:t>
+      </w:r>
+      <w:r>
+        <w:lastRenderedPageBreak/>
+        <w:t>reformat yourself – if it is program text, you may need to split the lines up. You can change the text size of verbatim text, perhaps with \small, and this may help. You can use the \- directive to show LaTeX where a word can be hyphen\-</w:t>
       </w:r>
       <w:proofErr w:type="spellStart"/>
       <w:r>
@@ -2720,29 +3038,282 @@
       </w:r>
       <w:proofErr w:type="spellEnd"/>
       <w:r>
-        <w:t xml:space="preserve">, if you have a word it doesn’t know, but in some </w:t>
-      </w:r>
+        <w:t>, if you have a word it doesn’t know, but in some cases you may have to modify the sentence to fix the problem; a very small change, like changing “such as” to “like” or vice-versa, may be enough.</w:t>
+      </w:r>
+    </w:p>
+    <w:p/>
+    <w:p>
+      <w:r>
+        <w:t>If you want to combine two separate images into a single figure, the usual way is to use \</w:t>
+      </w:r>
+      <w:proofErr w:type="spellStart"/>
+      <w:r>
+        <w:t>minipage</w:t>
+      </w:r>
+      <w:proofErr w:type="spellEnd"/>
+      <w:r>
+        <w:t xml:space="preserve">. But this has a subtle way of generating an overfull </w:t>
+      </w:r>
+      <w:proofErr w:type="spellStart"/>
+      <w:r>
+        <w:t>hbox</w:t>
+      </w:r>
+      <w:proofErr w:type="spellEnd"/>
+      <w:r>
+        <w:t>:</w:t>
+      </w:r>
+    </w:p>
+    <w:p/>
+    <w:p>
+      <w:pPr>
+        <w:rPr>
+          <w:rFonts w:ascii="Courier" w:hAnsi="Courier"/>
+        </w:rPr>
+      </w:pPr>
+      <w:r>
+        <w:rPr>
+          <w:rFonts w:ascii="Courier" w:hAnsi="Courier"/>
+        </w:rPr>
+        <w:t>\begin{</w:t>
+      </w:r>
+      <w:proofErr w:type="spellStart"/>
+      <w:r>
+        <w:rPr>
+          <w:rFonts w:ascii="Courier" w:hAnsi="Courier"/>
+        </w:rPr>
+        <w:t>minipage</w:t>
+      </w:r>
+      <w:proofErr w:type="spellEnd"/>
+      <w:r>
+        <w:rPr>
+          <w:rFonts w:ascii="Courier" w:hAnsi="Courier"/>
+        </w:rPr>
+        <w:t>}{0.3\</w:t>
+      </w:r>
+      <w:proofErr w:type="spellStart"/>
+      <w:r>
+        <w:rPr>
+          <w:rFonts w:ascii="Courier" w:hAnsi="Courier"/>
+        </w:rPr>
+        <w:t>textwidth</w:t>
+      </w:r>
+      <w:proofErr w:type="spellEnd"/>
+      <w:r>
+        <w:rPr>
+          <w:rFonts w:ascii="Courier" w:hAnsi="Courier"/>
+        </w:rPr>
+        <w:t>}</w:t>
+      </w:r>
+    </w:p>
+    <w:p>
+      <w:pPr>
+        <w:rPr>
+          <w:rFonts w:ascii="Courier" w:hAnsi="Courier"/>
+        </w:rPr>
+      </w:pPr>
+      <w:r>
+        <w:rPr>
+          <w:rFonts w:ascii="Courier" w:hAnsi="Courier"/>
+        </w:rPr>
+        <w:t>\</w:t>
+      </w:r>
+      <w:proofErr w:type="spellStart"/>
       <w:proofErr w:type="gramStart"/>
       <w:r>
-        <w:t>cases</w:t>
+        <w:rPr>
+          <w:rFonts w:ascii="Courier" w:hAnsi="Courier"/>
+        </w:rPr>
+        <w:t>includegraphics</w:t>
+      </w:r>
+      <w:proofErr w:type="spellEnd"/>
+      <w:r>
+        <w:rPr>
+          <w:rFonts w:ascii="Courier" w:hAnsi="Courier"/>
+        </w:rPr>
+        <w:t>{</w:t>
       </w:r>
       <w:proofErr w:type="gramEnd"/>
       <w:r>
-        <w:t xml:space="preserve"> you may have to modify the sentence to fix the problem; a very small change, like changing “such as” to “like” or vice-versa, may be enough.</w:t>
-      </w:r>
-    </w:p>
-    <w:p/>
-    <w:p>
-      <w:r>
-        <w:t>If you want to combine two separate images into a single figure, the usual way is to use \</w:t>
-      </w:r>
-      <w:proofErr w:type="spellStart"/>
-      <w:r>
+        <w:rPr>
+          <w:rFonts w:ascii="Courier" w:hAnsi="Courier"/>
+        </w:rPr>
+        <w:t>P999_f1.</w:t>
+      </w:r>
+      <w:r>
+        <w:rPr>
+          <w:rFonts w:ascii="Courier" w:hAnsi="Courier"/>
+        </w:rPr>
+        <w:t>jpg</w:t>
+      </w:r>
+      <w:r>
+        <w:rPr>
+          <w:rFonts w:ascii="Courier" w:hAnsi="Courier"/>
+        </w:rPr>
+        <w:t>}</w:t>
+      </w:r>
+    </w:p>
+    <w:p>
+      <w:pPr>
+        <w:rPr>
+          <w:rFonts w:ascii="Courier" w:hAnsi="Courier"/>
+        </w:rPr>
+      </w:pPr>
+      <w:r>
+        <w:rPr>
+          <w:rFonts w:ascii="Courier" w:hAnsi="Courier"/>
+        </w:rPr>
+        <w:t>\end{</w:t>
+      </w:r>
+      <w:proofErr w:type="spellStart"/>
+      <w:r>
+        <w:rPr>
+          <w:rFonts w:ascii="Courier" w:hAnsi="Courier"/>
+        </w:rPr>
         <w:t>minipage</w:t>
       </w:r>
       <w:proofErr w:type="spellEnd"/>
       <w:r>
-        <w:t xml:space="preserve">. But this has a subtle way of generating an overfull </w:t>
+        <w:rPr>
+          <w:rFonts w:ascii="Courier" w:hAnsi="Courier"/>
+        </w:rPr>
+        <w:t>}</w:t>
+      </w:r>
+    </w:p>
+    <w:p>
+      <w:pPr>
+        <w:rPr>
+          <w:rFonts w:ascii="Courier" w:hAnsi="Courier"/>
+        </w:rPr>
+      </w:pPr>
+      <w:r>
+        <w:rPr>
+          <w:rFonts w:ascii="Courier" w:hAnsi="Courier"/>
+        </w:rPr>
+        <w:t>\begin{</w:t>
+      </w:r>
+      <w:proofErr w:type="spellStart"/>
+      <w:r>
+        <w:rPr>
+          <w:rFonts w:ascii="Courier" w:hAnsi="Courier"/>
+        </w:rPr>
+        <w:t>minipage</w:t>
+      </w:r>
+      <w:proofErr w:type="spellEnd"/>
+      <w:r>
+        <w:rPr>
+          <w:rFonts w:ascii="Courier" w:hAnsi="Courier"/>
+        </w:rPr>
+        <w:t>}{0.7\</w:t>
+      </w:r>
+      <w:proofErr w:type="spellStart"/>
+      <w:r>
+        <w:rPr>
+          <w:rFonts w:ascii="Courier" w:hAnsi="Courier"/>
+        </w:rPr>
+        <w:t>textwidth</w:t>
+      </w:r>
+      <w:proofErr w:type="spellEnd"/>
+      <w:r>
+        <w:rPr>
+          <w:rFonts w:ascii="Courier" w:hAnsi="Courier"/>
+        </w:rPr>
+        <w:t>}</w:t>
+      </w:r>
+    </w:p>
+    <w:p>
+      <w:pPr>
+        <w:rPr>
+          <w:rFonts w:ascii="Courier" w:hAnsi="Courier"/>
+        </w:rPr>
+      </w:pPr>
+      <w:r>
+        <w:rPr>
+          <w:rFonts w:ascii="Courier" w:hAnsi="Courier"/>
+        </w:rPr>
+        <w:t>\</w:t>
+      </w:r>
+      <w:proofErr w:type="spellStart"/>
+      <w:proofErr w:type="gramStart"/>
+      <w:r>
+        <w:rPr>
+          <w:rFonts w:ascii="Courier" w:hAnsi="Courier"/>
+        </w:rPr>
+        <w:t>includegraphics</w:t>
+      </w:r>
+      <w:proofErr w:type="spellEnd"/>
+      <w:r>
+        <w:rPr>
+          <w:rFonts w:ascii="Courier" w:hAnsi="Courier"/>
+        </w:rPr>
+        <w:t>{</w:t>
+      </w:r>
+      <w:proofErr w:type="gramEnd"/>
+      <w:r>
+        <w:rPr>
+          <w:rFonts w:ascii="Courier" w:hAnsi="Courier"/>
+        </w:rPr>
+        <w:t>P999_f2a.</w:t>
+      </w:r>
+      <w:r>
+        <w:rPr>
+          <w:rFonts w:ascii="Courier" w:hAnsi="Courier"/>
+        </w:rPr>
+        <w:t>jpg</w:t>
+      </w:r>
+      <w:r>
+        <w:rPr>
+          <w:rFonts w:ascii="Courier" w:hAnsi="Courier"/>
+        </w:rPr>
+        <w:t>}</w:t>
+      </w:r>
+    </w:p>
+    <w:p>
+      <w:pPr>
+        <w:rPr>
+          <w:rFonts w:ascii="Courier" w:hAnsi="Courier"/>
+        </w:rPr>
+      </w:pPr>
+      <w:r>
+        <w:rPr>
+          <w:rFonts w:ascii="Courier" w:hAnsi="Courier"/>
+        </w:rPr>
+        <w:t>\end{</w:t>
+      </w:r>
+      <w:proofErr w:type="spellStart"/>
+      <w:r>
+        <w:rPr>
+          <w:rFonts w:ascii="Courier" w:hAnsi="Courier"/>
+        </w:rPr>
+        <w:t>minipage</w:t>
+      </w:r>
+      <w:proofErr w:type="spellEnd"/>
+      <w:r>
+        <w:rPr>
+          <w:rFonts w:ascii="Courier" w:hAnsi="Courier"/>
+        </w:rPr>
+        <w:t>}</w:t>
+      </w:r>
+    </w:p>
+    <w:p/>
+    <w:p>
+      <w:r>
+        <w:t xml:space="preserve">Here, the two </w:t>
+      </w:r>
+      <w:proofErr w:type="spellStart"/>
+      <w:r>
+        <w:t>minipages</w:t>
+      </w:r>
+      <w:proofErr w:type="spellEnd"/>
+      <w:r>
+        <w:t xml:space="preserve"> together take up exactly 1.0 of the </w:t>
+      </w:r>
+      <w:proofErr w:type="spellStart"/>
+      <w:r>
+        <w:t>textwidth</w:t>
+      </w:r>
+      <w:proofErr w:type="spellEnd"/>
+      <w:r>
+        <w:t xml:space="preserve"> (0.7 + 0.3). However, you get an overfull </w:t>
       </w:r>
       <w:proofErr w:type="spellStart"/>
       <w:r>
@@ -2750,353 +3321,116 @@
       </w:r>
       <w:proofErr w:type="spellEnd"/>
       <w:r>
-        <w:t>:</w:t>
-      </w:r>
-    </w:p>
-    <w:p/>
-    <w:p>
-      <w:pPr>
-        <w:rPr>
-          <w:rFonts w:ascii="Courier" w:hAnsi="Courier"/>
-        </w:rPr>
-      </w:pPr>
-      <w:r>
-        <w:rPr>
-          <w:rFonts w:ascii="Courier" w:hAnsi="Courier"/>
-        </w:rPr>
-        <w:t>\begin{</w:t>
-      </w:r>
-      <w:proofErr w:type="spellStart"/>
-      <w:r>
-        <w:rPr>
-          <w:rFonts w:ascii="Courier" w:hAnsi="Courier"/>
-        </w:rPr>
+        <w:t xml:space="preserve">. The problem is that each </w:t>
+      </w:r>
+      <w:proofErr w:type="spellStart"/>
+      <w:r>
         <w:t>minipage</w:t>
       </w:r>
       <w:proofErr w:type="spellEnd"/>
       <w:r>
-        <w:rPr>
-          <w:rFonts w:ascii="Courier" w:hAnsi="Courier"/>
-        </w:rPr>
-        <w:t>}{0.3\</w:t>
-      </w:r>
-      <w:proofErr w:type="spellStart"/>
-      <w:r>
-        <w:rPr>
-          <w:rFonts w:ascii="Courier" w:hAnsi="Courier"/>
-        </w:rPr>
-        <w:t>textwidth</w:t>
-      </w:r>
-      <w:proofErr w:type="spellEnd"/>
-      <w:r>
-        <w:rPr>
-          <w:rFonts w:ascii="Courier" w:hAnsi="Courier"/>
-        </w:rPr>
-        <w:t>}</w:t>
-      </w:r>
-    </w:p>
-    <w:p>
-      <w:pPr>
-        <w:rPr>
-          <w:rFonts w:ascii="Courier" w:hAnsi="Courier"/>
-        </w:rPr>
-      </w:pPr>
-      <w:r>
-        <w:rPr>
-          <w:rFonts w:ascii="Courier" w:hAnsi="Courier"/>
-        </w:rPr>
-        <w:t>\</w:t>
-      </w:r>
-      <w:proofErr w:type="spellStart"/>
+        <w:t xml:space="preserve"> is treated as a word by LaTeX, and it inserts an interword space between them. The (unintuitive) fix is to put a single ‘%’ after the first \end{</w:t>
+      </w:r>
+      <w:proofErr w:type="spellStart"/>
+      <w:r>
+        <w:t>minipage</w:t>
+      </w:r>
+      <w:proofErr w:type="spellEnd"/>
+      <w:r>
+        <w:t>}, so it becomes:</w:t>
+      </w:r>
+    </w:p>
+    <w:p/>
+    <w:p>
+      <w:pPr>
+        <w:rPr>
+          <w:rFonts w:ascii="Courier" w:hAnsi="Courier"/>
+        </w:rPr>
+      </w:pPr>
+      <w:r>
+        <w:rPr>
+          <w:rFonts w:ascii="Courier" w:hAnsi="Courier"/>
+        </w:rPr>
+        <w:t>\end{</w:t>
+      </w:r>
+      <w:proofErr w:type="spellStart"/>
+      <w:r>
+        <w:rPr>
+          <w:rFonts w:ascii="Courier" w:hAnsi="Courier"/>
+        </w:rPr>
+        <w:t>minipage</w:t>
+      </w:r>
+      <w:proofErr w:type="spellEnd"/>
+      <w:r>
+        <w:rPr>
+          <w:rFonts w:ascii="Courier" w:hAnsi="Courier"/>
+        </w:rPr>
+        <w:t>}%</w:t>
+      </w:r>
+    </w:p>
+    <w:p/>
+    <w:p>
+      <w:r>
+        <w:t>The opposite warning, an under full \</w:t>
+      </w:r>
+      <w:proofErr w:type="spellStart"/>
+      <w:r>
+        <w:t>hbox</w:t>
+      </w:r>
+      <w:proofErr w:type="spellEnd"/>
+      <w:r>
+        <w:t>, can be tolerated in some cases. You need to look carefully at the result to see how it looks. If a line has been spaced out by a ridiculous amount, some rewording may be needed. In general, you should avoid ending a line with ‘\\’ – this is a common cause of under full \</w:t>
+      </w:r>
+      <w:proofErr w:type="spellStart"/>
+      <w:r>
+        <w:t>hboxes</w:t>
+      </w:r>
+      <w:proofErr w:type="spellEnd"/>
+      <w:r>
+        <w:t>. The ASP convention is that there is not normally a blank line between paragraphs; you can use ‘\\’ to get this effect, and may feel it looks better, but it should be avoided.</w:t>
+      </w:r>
+    </w:p>
+    <w:p/>
+    <w:p>
+      <w:r>
+        <w:t>One genuine problem that, strangely, doesn’t always generate a warning is when the running heads (specified using \</w:t>
+      </w:r>
+      <w:proofErr w:type="spellStart"/>
+      <w:r>
+        <w:t>markboth</w:t>
+      </w:r>
+      <w:proofErr w:type="spellEnd"/>
+      <w:r>
+        <w:t xml:space="preserve"> at the start of the .</w:t>
+      </w:r>
+      <w:proofErr w:type="spellStart"/>
+      <w:r>
+        <w:t>tex</w:t>
+      </w:r>
+      <w:proofErr w:type="spellEnd"/>
+      <w:r>
+        <w:t xml:space="preserve"> file) overflow the space allowed. </w:t>
+      </w:r>
       <w:proofErr w:type="gramStart"/>
       <w:r>
-        <w:rPr>
-          <w:rFonts w:ascii="Courier" w:hAnsi="Courier"/>
-        </w:rPr>
-        <w:t>includegraphics</w:t>
-      </w:r>
-      <w:proofErr w:type="spellEnd"/>
-      <w:r>
-        <w:rPr>
-          <w:rFonts w:ascii="Courier" w:hAnsi="Courier"/>
-        </w:rPr>
-        <w:t>{</w:t>
+        <w:t>Usually</w:t>
       </w:r>
       <w:proofErr w:type="gramEnd"/>
       <w:r>
-        <w:rPr>
-          <w:rFonts w:ascii="Courier" w:hAnsi="Courier"/>
-        </w:rPr>
-        <w:t>P999_f1.eps}</w:t>
-      </w:r>
-    </w:p>
-    <w:p>
-      <w:pPr>
-        <w:rPr>
-          <w:rFonts w:ascii="Courier" w:hAnsi="Courier"/>
-        </w:rPr>
-      </w:pPr>
-      <w:r>
-        <w:rPr>
-          <w:rFonts w:ascii="Courier" w:hAnsi="Courier"/>
-        </w:rPr>
-        <w:t>\end{</w:t>
-      </w:r>
-      <w:proofErr w:type="spellStart"/>
-      <w:r>
-        <w:rPr>
-          <w:rFonts w:ascii="Courier" w:hAnsi="Courier"/>
-        </w:rPr>
-        <w:t>minipage</w:t>
-      </w:r>
-      <w:proofErr w:type="spellEnd"/>
-      <w:r>
-        <w:rPr>
-          <w:rFonts w:ascii="Courier" w:hAnsi="Courier"/>
-        </w:rPr>
-        <w:t>}</w:t>
-      </w:r>
-    </w:p>
-    <w:p>
-      <w:pPr>
-        <w:rPr>
-          <w:rFonts w:ascii="Courier" w:hAnsi="Courier"/>
-        </w:rPr>
-      </w:pPr>
-      <w:r>
-        <w:rPr>
-          <w:rFonts w:ascii="Courier" w:hAnsi="Courier"/>
-        </w:rPr>
-        <w:t>\begin{</w:t>
-      </w:r>
-      <w:proofErr w:type="spellStart"/>
-      <w:r>
-        <w:rPr>
-          <w:rFonts w:ascii="Courier" w:hAnsi="Courier"/>
-        </w:rPr>
-        <w:t>minipage</w:t>
-      </w:r>
-      <w:proofErr w:type="spellEnd"/>
-      <w:r>
-        <w:rPr>
-          <w:rFonts w:ascii="Courier" w:hAnsi="Courier"/>
-        </w:rPr>
-        <w:t>}{0.7\</w:t>
-      </w:r>
-      <w:proofErr w:type="spellStart"/>
-      <w:r>
-        <w:rPr>
-          <w:rFonts w:ascii="Courier" w:hAnsi="Courier"/>
-        </w:rPr>
-        <w:t>textwidth</w:t>
-      </w:r>
-      <w:proofErr w:type="spellEnd"/>
-      <w:r>
-        <w:rPr>
-          <w:rFonts w:ascii="Courier" w:hAnsi="Courier"/>
-        </w:rPr>
-        <w:t>}</w:t>
-      </w:r>
-    </w:p>
-    <w:p>
-      <w:pPr>
-        <w:rPr>
-          <w:rFonts w:ascii="Courier" w:hAnsi="Courier"/>
-        </w:rPr>
-      </w:pPr>
-      <w:r>
-        <w:rPr>
-          <w:rFonts w:ascii="Courier" w:hAnsi="Courier"/>
-        </w:rPr>
-        <w:t>\</w:t>
-      </w:r>
-      <w:proofErr w:type="spellStart"/>
+        <w:t xml:space="preserve"> the problem is the string used for the paper title; if this is too long it will push the page number on the </w:t>
+      </w:r>
       <w:proofErr w:type="gramStart"/>
       <w:r>
-        <w:rPr>
-          <w:rFonts w:ascii="Courier" w:hAnsi="Courier"/>
-        </w:rPr>
-        <w:t>includegraphics</w:t>
-      </w:r>
-      <w:proofErr w:type="spellEnd"/>
-      <w:r>
-        <w:rPr>
-          <w:rFonts w:ascii="Courier" w:hAnsi="Courier"/>
-        </w:rPr>
-        <w:t>{</w:t>
+        <w:t>right hand</w:t>
       </w:r>
       <w:proofErr w:type="gramEnd"/>
       <w:r>
-        <w:rPr>
-          <w:rFonts w:ascii="Courier" w:hAnsi="Courier"/>
-        </w:rPr>
-        <w:t>P999_f2a.eps}</w:t>
-      </w:r>
-    </w:p>
-    <w:p>
-      <w:pPr>
-        <w:rPr>
-          <w:rFonts w:ascii="Courier" w:hAnsi="Courier"/>
-        </w:rPr>
-      </w:pPr>
-      <w:r>
-        <w:rPr>
-          <w:rFonts w:ascii="Courier" w:hAnsi="Courier"/>
-        </w:rPr>
-        <w:t>\end{</w:t>
-      </w:r>
-      <w:proofErr w:type="spellStart"/>
-      <w:r>
-        <w:rPr>
-          <w:rFonts w:ascii="Courier" w:hAnsi="Courier"/>
-        </w:rPr>
-        <w:t>minipage</w:t>
-      </w:r>
-      <w:proofErr w:type="spellEnd"/>
-      <w:r>
-        <w:rPr>
-          <w:rFonts w:ascii="Courier" w:hAnsi="Courier"/>
-        </w:rPr>
-        <w:t>}</w:t>
-      </w:r>
-    </w:p>
-    <w:p/>
-    <w:p>
-      <w:r>
-        <w:t xml:space="preserve">Here, the two </w:t>
-      </w:r>
-      <w:proofErr w:type="spellStart"/>
-      <w:r>
-        <w:t>minipages</w:t>
-      </w:r>
-      <w:proofErr w:type="spellEnd"/>
-      <w:r>
-        <w:t xml:space="preserve"> together take up exactly 1.0 of the </w:t>
-      </w:r>
-      <w:proofErr w:type="spellStart"/>
-      <w:r>
-        <w:t>textwidth</w:t>
-      </w:r>
-      <w:proofErr w:type="spellEnd"/>
-      <w:r>
-        <w:t xml:space="preserve"> (0.7 + 0.3). However, you get an overfull </w:t>
-      </w:r>
-      <w:proofErr w:type="spellStart"/>
-      <w:r>
-        <w:t>hbox</w:t>
-      </w:r>
-      <w:proofErr w:type="spellEnd"/>
-      <w:r>
-        <w:t xml:space="preserve">. The problem is that each </w:t>
-      </w:r>
-      <w:proofErr w:type="spellStart"/>
-      <w:r>
-        <w:t>minipage</w:t>
-      </w:r>
-      <w:proofErr w:type="spellEnd"/>
-      <w:r>
-        <w:t xml:space="preserve"> is treated as a word by LaTeX, and it inserts an </w:t>
-      </w:r>
-      <w:proofErr w:type="spellStart"/>
-      <w:r>
-        <w:t>interword</w:t>
-      </w:r>
-      <w:proofErr w:type="spellEnd"/>
-      <w:r>
-        <w:t xml:space="preserve"> space between them. The (unintuitive) fix is to put a single ‘%’ after the first \end{</w:t>
-      </w:r>
-      <w:proofErr w:type="spellStart"/>
-      <w:r>
-        <w:t>minipage</w:t>
-      </w:r>
-      <w:proofErr w:type="spellEnd"/>
-      <w:r>
-        <w:t>}, so it becomes:</w:t>
-      </w:r>
-    </w:p>
-    <w:p/>
-    <w:p>
-      <w:pPr>
-        <w:rPr>
-          <w:rFonts w:ascii="Courier" w:hAnsi="Courier"/>
-        </w:rPr>
-      </w:pPr>
-      <w:r>
-        <w:rPr>
-          <w:rFonts w:ascii="Courier" w:hAnsi="Courier"/>
-        </w:rPr>
-        <w:t>\end{</w:t>
-      </w:r>
-      <w:proofErr w:type="spellStart"/>
-      <w:r>
-        <w:rPr>
-          <w:rFonts w:ascii="Courier" w:hAnsi="Courier"/>
-        </w:rPr>
-        <w:t>minipage</w:t>
-      </w:r>
-      <w:proofErr w:type="spellEnd"/>
-      <w:r>
-        <w:rPr>
-          <w:rFonts w:ascii="Courier" w:hAnsi="Courier"/>
-        </w:rPr>
-        <w:t>}%</w:t>
-      </w:r>
-    </w:p>
-    <w:p/>
-    <w:p>
-      <w:r>
-        <w:t>The opposite warning, an under full \</w:t>
-      </w:r>
-      <w:proofErr w:type="spellStart"/>
-      <w:r>
-        <w:t>hbox</w:t>
-      </w:r>
-      <w:proofErr w:type="spellEnd"/>
-      <w:r>
-        <w:t>, can be tolerated in some cases. You need to look carefully at the result to see how it looks. If a line has been spaced out by a ridiculous amount, some rewording may be needed. In general, you should avoid ending a line with ‘\\’ – this is a common cause of under full \</w:t>
-      </w:r>
-      <w:proofErr w:type="spellStart"/>
-      <w:r>
-        <w:t>hboxes</w:t>
-      </w:r>
-      <w:proofErr w:type="spellEnd"/>
-      <w:r>
-        <w:t>. The ASP convention is that there is not normally a blank line between paragraphs; you can use ‘\\’ to get this effect, and may feel it looks better, but it should be avoided.</w:t>
-      </w:r>
-    </w:p>
-    <w:p/>
-    <w:p>
-      <w:r>
-        <w:t>One genuine problem that, strangely, doesn’t always generate a warning is when the running heads (specified using \</w:t>
-      </w:r>
-      <w:proofErr w:type="spellStart"/>
-      <w:r>
-        <w:t>markboth</w:t>
-      </w:r>
-      <w:proofErr w:type="spellEnd"/>
-      <w:r>
-        <w:t xml:space="preserve"> at the start of the .</w:t>
-      </w:r>
-      <w:proofErr w:type="spellStart"/>
-      <w:r>
-        <w:t>tex</w:t>
-      </w:r>
-      <w:proofErr w:type="spellEnd"/>
-      <w:r>
-        <w:t xml:space="preserve"> file) overflow the space allowed. </w:t>
-      </w:r>
-      <w:proofErr w:type="gramStart"/>
-      <w:r>
-        <w:t>Usually</w:t>
-      </w:r>
-      <w:proofErr w:type="gramEnd"/>
-      <w:r>
-        <w:t xml:space="preserve"> the problem is the string used for the paper title; if this is too long it will push the page number on the right hand page over past the page margin. Oddly, LaTeX just lets this happen. If you have a long paper title, check that this isn’t happening.</w:t>
-      </w:r>
-    </w:p>
-    <w:p>
-      <w:pPr>
-        <w:pStyle w:val="Titre1"/>
+        <w:t xml:space="preserve"> page over past the page margin. Oddly, LaTeX just lets this happen. If you have a long paper title, check that this isn’t happening.</w:t>
+      </w:r>
+    </w:p>
+    <w:p>
+      <w:pPr>
+        <w:pStyle w:val="Heading1"/>
       </w:pPr>
       <w:bookmarkStart w:id="5" w:name="_Ref493090667"/>
       <w:bookmarkEnd w:id="5"/>
@@ -3279,12 +3613,18 @@
         <w:t>{</w:t>
       </w:r>
       <w:proofErr w:type="spellStart"/>
+      <w:r>
+        <w:rPr>
+          <w:rFonts w:ascii="Courier" w:hAnsi="Courier"/>
+        </w:rPr>
+        <w:t>Smith,~</w:t>
+      </w:r>
       <w:proofErr w:type="gramEnd"/>
       <w:r>
         <w:rPr>
           <w:rFonts w:ascii="Courier" w:hAnsi="Courier"/>
         </w:rPr>
-        <w:t>Smith,~J</w:t>
+        <w:t>J</w:t>
       </w:r>
       <w:proofErr w:type="spellEnd"/>
       <w:r>
@@ -3329,11 +3669,19 @@
         <w:t xml:space="preserve">Vargas </w:t>
       </w:r>
       <w:proofErr w:type="spellStart"/>
-      <w:r>
-        <w:rPr>
-          <w:rFonts w:ascii="Courier" w:hAnsi="Courier"/>
-        </w:rPr>
-        <w:t>Llosa,~M</w:t>
+      <w:proofErr w:type="gramStart"/>
+      <w:r>
+        <w:rPr>
+          <w:rFonts w:ascii="Courier" w:hAnsi="Courier"/>
+        </w:rPr>
+        <w:t>Llosa,~</w:t>
+      </w:r>
+      <w:proofErr w:type="gramEnd"/>
+      <w:r>
+        <w:rPr>
+          <w:rFonts w:ascii="Courier" w:hAnsi="Courier"/>
+        </w:rPr>
+        <w:t>M</w:t>
       </w:r>
       <w:proofErr w:type="spellEnd"/>
       <w:r>
@@ -3371,12 +3719,18 @@
         <w:t>{</w:t>
       </w:r>
       <w:proofErr w:type="spellStart"/>
+      <w:r>
+        <w:rPr>
+          <w:rFonts w:ascii="Courier" w:hAnsi="Courier"/>
+        </w:rPr>
+        <w:t>Kennedy,~</w:t>
+      </w:r>
       <w:proofErr w:type="gramEnd"/>
       <w:r>
         <w:rPr>
           <w:rFonts w:ascii="Courier" w:hAnsi="Courier"/>
         </w:rPr>
-        <w:t>Kennedy,~J.~F</w:t>
+        <w:t>J.~F</w:t>
       </w:r>
       <w:proofErr w:type="spellEnd"/>
       <w:r>
@@ -3395,6 +3749,7 @@
     </w:p>
     <w:p>
       <w:r>
+        <w:lastRenderedPageBreak/>
         <w:t>Note that these entries need to be commented out, as they will only be recognised when the final volume is constructed – at which point they will automatically be uncommented. Each initial must have a period after it, and a ~ before it to get the spacing correct.</w:t>
       </w:r>
     </w:p>
@@ -3433,12 +3788,18 @@
         <w:t>{</w:t>
       </w:r>
       <w:proofErr w:type="spellStart"/>
+      <w:r>
+        <w:rPr>
+          <w:rFonts w:ascii="Courier" w:hAnsi="Courier"/>
+        </w:rPr>
+        <w:t>Picard,~</w:t>
+      </w:r>
       <w:proofErr w:type="gramEnd"/>
       <w:r>
         <w:rPr>
           <w:rFonts w:ascii="Courier" w:hAnsi="Courier"/>
         </w:rPr>
-        <w:t>Picard,~J.-L</w:t>
+        <w:t>J.-L</w:t>
       </w:r>
       <w:proofErr w:type="spellEnd"/>
       <w:r>
@@ -3476,12 +3837,32 @@
         <w:t>{</w:t>
       </w:r>
       <w:proofErr w:type="spellStart"/>
+      <w:r>
+        <w:rPr>
+          <w:rFonts w:ascii="Courier" w:hAnsi="Courier"/>
+        </w:rPr>
+        <w:t>Downey,~</w:t>
+      </w:r>
       <w:proofErr w:type="gramEnd"/>
       <w:r>
         <w:rPr>
           <w:rFonts w:ascii="Courier" w:hAnsi="Courier"/>
         </w:rPr>
-        <w:t>Downey,~R.~J.,~Jr</w:t>
+        <w:t>R.~</w:t>
+      </w:r>
+      <w:proofErr w:type="gramStart"/>
+      <w:r>
+        <w:rPr>
+          <w:rFonts w:ascii="Courier" w:hAnsi="Courier"/>
+        </w:rPr>
+        <w:t>J.,~</w:t>
+      </w:r>
+      <w:proofErr w:type="gramEnd"/>
+      <w:r>
+        <w:rPr>
+          <w:rFonts w:ascii="Courier" w:hAnsi="Courier"/>
+        </w:rPr>
+        <w:t>Jr</w:t>
       </w:r>
       <w:proofErr w:type="spellEnd"/>
       <w:r>
@@ -3519,12 +3900,18 @@
         <w:t>{</w:t>
       </w:r>
       <w:proofErr w:type="spellStart"/>
+      <w:r>
+        <w:rPr>
+          <w:rFonts w:ascii="Courier" w:hAnsi="Courier"/>
+        </w:rPr>
+        <w:t>Fairbanks,~D.,~</w:t>
+      </w:r>
       <w:proofErr w:type="gramEnd"/>
       <w:r>
         <w:rPr>
           <w:rFonts w:ascii="Courier" w:hAnsi="Courier"/>
         </w:rPr>
-        <w:t>Fairbanks,~D.,~Sr</w:t>
+        <w:t>Sr</w:t>
       </w:r>
       <w:proofErr w:type="spellEnd"/>
       <w:r>
@@ -3567,7 +3954,21 @@
         <w:rPr>
           <w:rFonts w:ascii="Courier" w:hAnsi="Courier"/>
         </w:rPr>
-        <w:t>Lloyd-Webber,~A</w:t>
+        <w:t>Lloyd-</w:t>
+      </w:r>
+      <w:proofErr w:type="gramStart"/>
+      <w:r>
+        <w:rPr>
+          <w:rFonts w:ascii="Courier" w:hAnsi="Courier"/>
+        </w:rPr>
+        <w:t>Webber,~</w:t>
+      </w:r>
+      <w:proofErr w:type="gramEnd"/>
+      <w:r>
+        <w:rPr>
+          <w:rFonts w:ascii="Courier" w:hAnsi="Courier"/>
+        </w:rPr>
+        <w:t>A</w:t>
       </w:r>
       <w:proofErr w:type="spellEnd"/>
       <w:r>
@@ -3617,19 +4018,28 @@
         <w:t xml:space="preserve">Van der </w:t>
       </w:r>
       <w:proofErr w:type="spellStart"/>
+      <w:proofErr w:type="gramStart"/>
       <w:r>
         <w:rPr>
           <w:rFonts w:ascii="Courier" w:hAnsi="Courier"/>
           <w:lang w:val="nl-NL"/>
         </w:rPr>
-        <w:t>Waals,~J.~D</w:t>
-      </w:r>
-      <w:proofErr w:type="spellEnd"/>
+        <w:t>Waals,~</w:t>
+      </w:r>
+      <w:proofErr w:type="gramEnd"/>
       <w:r>
         <w:rPr>
           <w:rFonts w:ascii="Courier" w:hAnsi="Courier"/>
           <w:lang w:val="nl-NL"/>
         </w:rPr>
+        <w:t>J.~D</w:t>
+      </w:r>
+      <w:proofErr w:type="spellEnd"/>
+      <w:r>
+        <w:rPr>
+          <w:rFonts w:ascii="Courier" w:hAnsi="Courier"/>
+          <w:lang w:val="nl-NL"/>
+        </w:rPr>
         <w:t>.)</w:t>
       </w:r>
     </w:p>
@@ -3648,7 +4058,7 @@
         <w:rPr>
           <w:rStyle w:val="FootnoteAnchor"/>
         </w:rPr>
-        <w:footnoteReference w:id="8"/>
+        <w:footnoteReference w:id="7"/>
       </w:r>
       <w:r>
         <w:t xml:space="preserve"> The editors will try to spot these cases, but it’s much easier if they don’t have to.</w:t>
@@ -3656,7 +4066,7 @@
     </w:p>
     <w:p>
       <w:pPr>
-        <w:pStyle w:val="Titre1"/>
+        <w:pStyle w:val="Heading1"/>
       </w:pPr>
       <w:bookmarkStart w:id="6" w:name="_Ref493090516"/>
       <w:bookmarkEnd w:id="6"/>
@@ -3924,7 +4334,7 @@
     <w:p/>
     <w:p>
       <w:pPr>
-        <w:pStyle w:val="Paragraphedeliste"/>
+        <w:pStyle w:val="ListParagraph"/>
         <w:numPr>
           <w:ilvl w:val="0"/>
           <w:numId w:val="3"/>
@@ -3937,7 +4347,7 @@
     <w:p/>
     <w:p>
       <w:pPr>
-        <w:pStyle w:val="Paragraphedeliste"/>
+        <w:pStyle w:val="ListParagraph"/>
         <w:numPr>
           <w:ilvl w:val="0"/>
           <w:numId w:val="3"/>
@@ -3950,7 +4360,7 @@
     <w:p/>
     <w:p>
       <w:pPr>
-        <w:pStyle w:val="Paragraphedeliste"/>
+        <w:pStyle w:val="ListParagraph"/>
         <w:numPr>
           <w:ilvl w:val="0"/>
           <w:numId w:val="3"/>
@@ -3971,7 +4381,7 @@
     <w:p/>
     <w:p>
       <w:pPr>
-        <w:pStyle w:val="Paragraphedeliste"/>
+        <w:pStyle w:val="ListParagraph"/>
         <w:numPr>
           <w:ilvl w:val="0"/>
           <w:numId w:val="3"/>
@@ -3984,7 +4394,7 @@
     <w:p/>
     <w:p>
       <w:pPr>
-        <w:pStyle w:val="Paragraphedeliste"/>
+        <w:pStyle w:val="ListParagraph"/>
         <w:numPr>
           <w:ilvl w:val="0"/>
           <w:numId w:val="3"/>
@@ -3997,7 +4407,7 @@
     <w:p/>
     <w:p>
       <w:pPr>
-        <w:pStyle w:val="Paragraphedeliste"/>
+        <w:pStyle w:val="ListParagraph"/>
         <w:numPr>
           <w:ilvl w:val="0"/>
           <w:numId w:val="3"/>
@@ -4015,7 +4425,7 @@
     </w:p>
     <w:p>
       <w:pPr>
-        <w:pStyle w:val="Titre1"/>
+        <w:pStyle w:val="Heading1"/>
       </w:pPr>
       <w:bookmarkStart w:id="7" w:name="_Ref493090408"/>
       <w:bookmarkEnd w:id="7"/>
@@ -4040,7 +4450,13 @@
       </w:r>
       <w:proofErr w:type="spellEnd"/>
       <w:r>
-        <w:t>{asp2014} at the start of the .</w:t>
+        <w:t>{asp20</w:t>
+      </w:r>
+      <w:r>
+        <w:t>21</w:t>
+      </w:r>
+      <w:r>
+        <w:t>} at the start of the .</w:t>
       </w:r>
       <w:proofErr w:type="spellStart"/>
       <w:r>
@@ -4078,12 +4494,19 @@
       </w:r>
       <w:proofErr w:type="spellEnd"/>
       <w:r>
-        <w:t xml:space="preserve"> package performs global redefinitions of some key formatting quantities and must not be used). The asp2014 package itself includes all the packages that are usually needed. There is a list of these packages in the ASP ‘Instructions for Authors and Editors’ (appendix E). If you believe you really do need to make use of a specific additional LaTeX package, contact the ADASS editors.</w:t>
-      </w:r>
-    </w:p>
-    <w:p/>
-    <w:p>
-      <w:r>
+        <w:t xml:space="preserve"> package performs global redefinitions of some key formatting quantities and must not be used). The asp20</w:t>
+      </w:r>
+      <w:r>
+        <w:t>21</w:t>
+      </w:r>
+      <w:r>
+        <w:t xml:space="preserve"> package itself includes all the packages that are usually needed. There is a list of these packages in the ASP ‘Instructions for Authors and Editors’ (appendix E). If you believe you really do need to make use of a specific additional LaTeX package, contact the ADASS editors.</w:t>
+      </w:r>
+    </w:p>
+    <w:p/>
+    <w:p>
+      <w:r>
+        <w:lastRenderedPageBreak/>
         <w:t>You should avoid changing the font size used for normal text in your paper. However, it is OK to save space by setting verbatim text, or tables, in a smaller font using \small or even \</w:t>
       </w:r>
       <w:proofErr w:type="spellStart"/>
@@ -4127,7 +4550,7 @@
     </w:p>
     <w:p>
       <w:pPr>
-        <w:pStyle w:val="Titre1"/>
+        <w:pStyle w:val="Heading1"/>
       </w:pPr>
       <w:bookmarkStart w:id="8" w:name="_Ref493090734"/>
       <w:bookmarkEnd w:id="8"/>
@@ -4158,13 +4581,21 @@
       </w:r>
       <w:proofErr w:type="gramEnd"/>
       <w:r>
-        <w:t>see here} ..." rather than "... like this\footnote{see here}, ...". The difference is that the comma should go before the footnote, rather than after. Different languages seem to have different conventions, but this is what the Chicago Manual of Style recommends.</w:t>
+        <w:t>see here} ..." rather than "... like this\</w:t>
+      </w:r>
+      <w:proofErr w:type="gramStart"/>
+      <w:r>
+        <w:t>footnote{</w:t>
+      </w:r>
+      <w:proofErr w:type="gramEnd"/>
+      <w:r>
+        <w:t>see here}, ...". The difference is that the comma should go before the footnote, rather than after. Different languages seem to have different conventions, but this is what the Chicago Manual of Style recommends.</w:t>
       </w:r>
       <w:r>
         <w:rPr>
           <w:rStyle w:val="FootnoteAnchor"/>
         </w:rPr>
-        <w:footnoteReference w:id="9"/>
+        <w:footnoteReference w:id="8"/>
       </w:r>
       <w:r>
         <w:t xml:space="preserve"> </w:t>
@@ -4245,7 +4676,11 @@
     <w:p/>
     <w:p>
       <w:r>
-        <w:t>Papers ought to be run through a spelling checker (set to your choice of British or US English). This can be tricky with LaTeX text, where there are so many “words” like “\</w:t>
+        <w:t xml:space="preserve">Papers ought to be run through a spelling checker (set to your choice of British or US English). This can be tricky with LaTeX text, where there are so many </w:t>
+      </w:r>
+      <w:r>
+        <w:lastRenderedPageBreak/>
+        <w:t>“words” like “\</w:t>
       </w:r>
       <w:proofErr w:type="spellStart"/>
       <w:r>
@@ -4287,7 +4722,7 @@
     <w:p/>
     <w:p>
       <w:pPr>
-        <w:pStyle w:val="Paragraphedeliste"/>
+        <w:pStyle w:val="ListParagraph"/>
         <w:numPr>
           <w:ilvl w:val="0"/>
           <w:numId w:val="2"/>
@@ -4309,7 +4744,7 @@
     <w:p/>
     <w:p>
       <w:pPr>
-        <w:pStyle w:val="Paragraphedeliste"/>
+        <w:pStyle w:val="ListParagraph"/>
         <w:numPr>
           <w:ilvl w:val="0"/>
           <w:numId w:val="2"/>
@@ -4322,7 +4757,7 @@
     <w:p/>
     <w:p>
       <w:pPr>
-        <w:pStyle w:val="Paragraphedeliste"/>
+        <w:pStyle w:val="ListParagraph"/>
         <w:numPr>
           <w:ilvl w:val="0"/>
           <w:numId w:val="2"/>
@@ -4343,7 +4778,7 @@
     <w:p/>
     <w:p>
       <w:pPr>
-        <w:pStyle w:val="Paragraphedeliste"/>
+        <w:pStyle w:val="ListParagraph"/>
         <w:numPr>
           <w:ilvl w:val="0"/>
           <w:numId w:val="2"/>
@@ -4356,7 +4791,7 @@
     <w:p/>
     <w:p>
       <w:pPr>
-        <w:pStyle w:val="Paragraphedeliste"/>
+        <w:pStyle w:val="ListParagraph"/>
         <w:numPr>
           <w:ilvl w:val="0"/>
           <w:numId w:val="2"/>
@@ -4369,7 +4804,7 @@
     <w:p/>
     <w:p>
       <w:pPr>
-        <w:pStyle w:val="Paragraphedeliste"/>
+        <w:pStyle w:val="ListParagraph"/>
         <w:numPr>
           <w:ilvl w:val="0"/>
           <w:numId w:val="2"/>
@@ -4396,9 +4831,10 @@
     </w:p>
     <w:p>
       <w:pPr>
-        <w:pStyle w:val="Titre1"/>
-      </w:pPr>
-      <w:r>
+        <w:pStyle w:val="Heading1"/>
+      </w:pPr>
+      <w:r>
+        <w:lastRenderedPageBreak/>
         <w:t>Copyright form</w:t>
       </w:r>
     </w:p>
@@ -4422,7 +4858,7 @@
     </w:p>
     <w:p>
       <w:pPr>
-        <w:pStyle w:val="Titre1"/>
+        <w:pStyle w:val="Heading1"/>
       </w:pPr>
       <w:bookmarkStart w:id="9" w:name="_Ref493090654"/>
       <w:bookmarkEnd w:id="9"/>
@@ -4446,7 +4882,7 @@
     </w:p>
     <w:p>
       <w:pPr>
-        <w:pStyle w:val="Titre1"/>
+        <w:pStyle w:val="Heading1"/>
       </w:pPr>
       <w:r>
         <w:t>Appendix: The PaperCheck.py script</w:t>
@@ -4667,7 +5103,24 @@
       </w:r>
       <w:proofErr w:type="spellEnd"/>
       <w:r>
-        <w:t xml:space="preserve"> entries, that all references are supplied, and that no additional references are included in the .bib file. It checks that graphics files are .eps files, as required, and that they are in the top-level directory. It checks that all the graphics files supplied are in fact used by the .</w:t>
+        <w:t xml:space="preserve"> entries, that all references are supplied, and that no additional references are included in the .bib file. It checks that graphics files are .</w:t>
+      </w:r>
+      <w:r>
+        <w:t>jpg or .</w:t>
+      </w:r>
+      <w:proofErr w:type="spellStart"/>
+      <w:r>
+        <w:t>png</w:t>
+      </w:r>
+      <w:proofErr w:type="spellEnd"/>
+      <w:r>
+        <w:t xml:space="preserve"> files</w:t>
+      </w:r>
+      <w:r>
+        <w:t xml:space="preserve"> (and not .eps)</w:t>
+      </w:r>
+      <w:r>
+        <w:t>, as required, and that they are in the top-level directory. It checks that all the graphics files supplied are in fact used by the .</w:t>
       </w:r>
       <w:proofErr w:type="spellStart"/>
       <w:r>
@@ -4876,7 +5329,11 @@
     <w:p/>
     <w:p>
       <w:r>
-        <w:t xml:space="preserve">Many papers have problems with the \author list. This is partly because the ASP rules for the format of the list of authors are very precise and it is very easy to get a comma in the wrong place or to forget that authors should be listed with the surname last (unlike the standard way of listing authors for references). Problems such as this should be fixed, but there are cases where the parser will flag a possible problem with a perfectly correct author list. For example, if an author has a multi-word surname like “di Marco”, the parser will get this right, but will ask for this to be checked. It is a good idea to check the parsing of the author list in the detailed </w:t>
+        <w:t xml:space="preserve">Many papers have problems with the \author list. This is partly because the ASP rules for the format of the list of authors are very precise and it is very easy to get a comma in the wrong place or to forget that authors should be listed with the surname last (unlike the standard way of listing authors for references). Problems such as this should be fixed, but there are cases where the parser will flag a possible problem with a perfectly correct author list. For example, if an author has a multi-word surname like “di Marco”, the parser will get this right, </w:t>
+      </w:r>
+      <w:r>
+        <w:lastRenderedPageBreak/>
+        <w:t xml:space="preserve">but will ask for this to be checked. It is a good idea to check the parsing of the author list in the detailed </w:t>
       </w:r>
       <w:proofErr w:type="spellStart"/>
       <w:r>
@@ -4912,7 +5369,7 @@
     <w:p/>
     <w:p>
       <w:pPr>
-        <w:pStyle w:val="Titre1"/>
+        <w:pStyle w:val="Heading1"/>
       </w:pPr>
       <w:bookmarkStart w:id="10" w:name="_Ref493090765"/>
       <w:bookmarkEnd w:id="10"/>
@@ -5009,10 +5466,12 @@
         <w:t>\</w:t>
       </w:r>
       <w:proofErr w:type="spellStart"/>
+      <w:proofErr w:type="gramStart"/>
       <w:r>
         <w:t>ssindex</w:t>
       </w:r>
       <w:proofErr w:type="spellEnd"/>
+      <w:proofErr w:type="gramEnd"/>
       <w:r>
         <w:t>{</w:t>
       </w:r>
@@ -5023,7 +5482,15 @@
       </w:r>
       <w:proofErr w:type="gramEnd"/>
       <w:r>
-        <w:t>-topic!sub-sub-topic</w:t>
+        <w:t>-</w:t>
+      </w:r>
+      <w:proofErr w:type="gramStart"/>
+      <w:r>
+        <w:t>topic!sub</w:t>
+      </w:r>
+      <w:proofErr w:type="gramEnd"/>
+      <w:r>
+        <w:t>-sub-topic</w:t>
       </w:r>
       <w:proofErr w:type="spellEnd"/>
       <w:r>
@@ -5050,6 +5517,7 @@
         <w:t>\</w:t>
       </w:r>
       <w:proofErr w:type="spellStart"/>
+      <w:proofErr w:type="gramStart"/>
       <w:r>
         <w:rPr>
           <w:lang w:val="en-GB"/>
@@ -5057,6 +5525,7 @@
         <w:t>ssindex</w:t>
       </w:r>
       <w:proofErr w:type="spellEnd"/>
+      <w:proofErr w:type="gramEnd"/>
       <w:r>
         <w:rPr>
           <w:lang w:val="en-GB"/>
@@ -5076,9 +5545,17 @@
         <w:rPr>
           <w:lang w:val="en-GB"/>
         </w:rPr>
-        <w:t>-based!VLT</w:t>
-      </w:r>
-      <w:proofErr w:type="spellEnd"/>
+        <w:t>-</w:t>
+      </w:r>
+      <w:proofErr w:type="gramStart"/>
+      <w:r>
+        <w:rPr>
+          <w:lang w:val="en-GB"/>
+        </w:rPr>
+        <w:t>based!VLT</w:t>
+      </w:r>
+      <w:proofErr w:type="spellEnd"/>
+      <w:proofErr w:type="gramEnd"/>
       <w:r>
         <w:rPr>
           <w:lang w:val="en-GB"/>
@@ -5180,9 +5657,17 @@
         <w:rPr>
           <w:lang w:val="en-GB"/>
         </w:rPr>
-        <w:t>-based!VLT</w:t>
-      </w:r>
-      <w:proofErr w:type="spellEnd"/>
+        <w:t>-</w:t>
+      </w:r>
+      <w:proofErr w:type="gramStart"/>
+      <w:r>
+        <w:rPr>
+          <w:lang w:val="en-GB"/>
+        </w:rPr>
+        <w:t>based!VLT</w:t>
+      </w:r>
+      <w:proofErr w:type="spellEnd"/>
+      <w:proofErr w:type="gramEnd"/>
       <w:r>
         <w:rPr>
           <w:lang w:val="en-GB"/>
@@ -5320,6 +5805,7 @@
         <w:t>VLT}, \</w:t>
       </w:r>
       <w:proofErr w:type="spellStart"/>
+      <w:proofErr w:type="gramStart"/>
       <w:r>
         <w:rPr>
           <w:lang w:val="en-GB"/>
@@ -5341,6 +5827,7 @@
         <w:t>telescopes!Very</w:t>
       </w:r>
       <w:proofErr w:type="spellEnd"/>
+      <w:proofErr w:type="gramEnd"/>
       <w:r>
         <w:rPr>
           <w:lang w:val="en-GB"/>
@@ -5377,7 +5864,7 @@
     </w:p>
     <w:p>
       <w:pPr>
-        <w:pStyle w:val="Paragraphedeliste"/>
+        <w:pStyle w:val="ListParagraph"/>
         <w:numPr>
           <w:ilvl w:val="0"/>
           <w:numId w:val="4"/>
@@ -5416,7 +5903,7 @@
     </w:p>
     <w:p>
       <w:pPr>
-        <w:pStyle w:val="Paragraphedeliste"/>
+        <w:pStyle w:val="ListParagraph"/>
         <w:numPr>
           <w:ilvl w:val="0"/>
           <w:numId w:val="4"/>
@@ -5583,6 +6070,7 @@
         <w:pStyle w:val="Terminal"/>
       </w:pPr>
       <w:r>
+        <w:lastRenderedPageBreak/>
         <w:t>%\</w:t>
       </w:r>
       <w:proofErr w:type="spellStart"/>
@@ -5600,9 +6088,14 @@
       </w:r>
       <w:proofErr w:type="gramEnd"/>
       <w:r>
-        <w:t>-based!VLT</w:t>
-      </w:r>
-      <w:proofErr w:type="spellEnd"/>
+        <w:t>-</w:t>
+      </w:r>
+      <w:proofErr w:type="gramStart"/>
+      <w:r>
+        <w:t>based!VLT</w:t>
+      </w:r>
+      <w:proofErr w:type="spellEnd"/>
+      <w:proofErr w:type="gramEnd"/>
       <w:r>
         <w:t>}</w:t>
       </w:r>
@@ -5654,9 +6147,14 @@
       </w:r>
       <w:proofErr w:type="gramEnd"/>
       <w:r>
-        <w:t>-based!VLT</w:t>
-      </w:r>
-      <w:proofErr w:type="spellEnd"/>
+        <w:t>-</w:t>
+      </w:r>
+      <w:proofErr w:type="gramStart"/>
+      <w:r>
+        <w:t>based!VLT</w:t>
+      </w:r>
+      <w:proofErr w:type="spellEnd"/>
+      <w:proofErr w:type="gramEnd"/>
       <w:r>
         <w:t xml:space="preserve">} </w:t>
       </w:r>
@@ -5838,9 +6336,14 @@
       </w:r>
       <w:proofErr w:type="gramEnd"/>
       <w:r>
-        <w:t>-based!LLT</w:t>
-      </w:r>
-      <w:proofErr w:type="spellEnd"/>
+        <w:t>-</w:t>
+      </w:r>
+      <w:proofErr w:type="gramStart"/>
+      <w:r>
+        <w:t>based!LLT</w:t>
+      </w:r>
+      <w:proofErr w:type="spellEnd"/>
+      <w:proofErr w:type="gramEnd"/>
       <w:r>
         <w:t>}</w:t>
       </w:r>
@@ -5894,7 +6397,7 @@
     </w:p>
     <w:p>
       <w:pPr>
-        <w:pStyle w:val="Titre1"/>
+        <w:pStyle w:val="Heading1"/>
       </w:pPr>
       <w:bookmarkStart w:id="11" w:name="_Ref4930907651"/>
       <w:r>
@@ -6164,7 +6667,7 @@
     </w:p>
     <w:p>
       <w:pPr>
-        <w:pStyle w:val="Titre1"/>
+        <w:pStyle w:val="Heading1"/>
       </w:pPr>
       <w:bookmarkStart w:id="12" w:name="_Ref49309076511"/>
       <w:r>
@@ -6356,7 +6859,16 @@
       </w:r>
       <w:proofErr w:type="gramStart"/>
       <w:r>
-        <w:t>P13-20_f1.eps  P13-20_f2.eps</w:t>
+        <w:t>P13-20_f1.</w:t>
+      </w:r>
+      <w:r>
+        <w:t>jpg</w:t>
+      </w:r>
+      <w:r>
+        <w:t xml:space="preserve">  P13-20_f2.</w:t>
+      </w:r>
+      <w:r>
+        <w:t>jpg</w:t>
       </w:r>
       <w:proofErr w:type="gramEnd"/>
     </w:p>
@@ -6499,6 +7011,7 @@
           <w:rFonts w:ascii="Cambria" w:eastAsiaTheme="majorEastAsia" w:hAnsi="Cambria" w:cstheme="majorBidi"/>
           <w:lang w:val="en-GB"/>
         </w:rPr>
+        <w:lastRenderedPageBreak/>
         <w:t>but if you are curious, you will see a few more targets that your ADASS proceedings editors will use to try and integrate your paper into the final book. The make tar/zip targets will make the correct archive, with just the files the editors need, nothing more and nothing less. This theoretically makes their ingestion a 10 second job! Pretty please.</w:t>
       </w:r>
       <w:r>
@@ -6507,9 +7020,10 @@
     </w:p>
     <w:p>
       <w:pPr>
-        <w:pStyle w:val="Titre2"/>
-      </w:pPr>
-      <w:r>
+        <w:pStyle w:val="Heading2"/>
+      </w:pPr>
+      <w:r>
+        <w:lastRenderedPageBreak/>
         <w:t>History</w:t>
       </w:r>
     </w:p>
@@ -6576,6 +7090,19 @@
     <w:p>
       <w:r>
         <w:t>Modified October 2022 for ADASS XXXII in Canada</w:t>
+      </w:r>
+    </w:p>
+    <w:p>
+      <w:r>
+        <w:t>Modified December 2025 for ADASS XXXV in Görlitz, Germany. The main change describes the move from .eps graphics files to .jpg and .</w:t>
+      </w:r>
+      <w:proofErr w:type="spellStart"/>
+      <w:r>
+        <w:t>png</w:t>
+      </w:r>
+      <w:proofErr w:type="spellEnd"/>
+      <w:r>
+        <w:t xml:space="preserve"> files.</w:t>
       </w:r>
     </w:p>
     <w:sectPr>
@@ -6592,7 +7119,7 @@
 </file>
 
 <file path=word/endnotes.xml><?xml version="1.0" encoding="utf-8"?>
-<w:endnotes xmlns:wpc="http://schemas.microsoft.com/office/word/2010/wordprocessingCanvas" xmlns:cx="http://schemas.microsoft.com/office/drawing/2014/chartex" xmlns:cx1="http://schemas.microsoft.com/office/drawing/2015/9/8/chartex" xmlns:cx2="http://schemas.microsoft.com/office/drawing/2015/10/21/chartex" xmlns:cx3="http://schemas.microsoft.com/office/drawing/2016/5/9/chartex" xmlns:cx4="http://schemas.microsoft.com/office/drawing/2016/5/10/chartex" xmlns:cx5="http://schemas.microsoft.com/office/drawing/2016/5/11/chartex" xmlns:cx6="http://schemas.microsoft.com/office/drawing/2016/5/12/chartex" xmlns:cx7="http://schemas.microsoft.com/office/drawing/2016/5/13/chartex" xmlns:cx8="http://schemas.microsoft.com/office/drawing/2016/5/14/chartex" xmlns:mc="http://schemas.openxmlformats.org/markup-compatibility/2006" xmlns:aink="http://schemas.microsoft.com/office/drawing/2016/ink" xmlns:am3d="http://schemas.microsoft.com/office/drawing/2017/model3d" xmlns:o="urn:schemas-microsoft-com:office:office" xmlns:oel="http://schemas.microsoft.com/office/2019/extlst" xmlns:r="http://schemas.openxmlformats.org/officeDocument/2006/relationships" xmlns:m="http://schemas.openxmlformats.org/officeDocument/2006/math" xmlns:v="urn:schemas-microsoft-com:vml" xmlns:wp14="http://schemas.microsoft.com/office/word/2010/wordprocessingDrawing" xmlns:wp="http://schemas.openxmlformats.org/drawingml/2006/wordprocessingDrawing" xmlns:w10="urn:schemas-microsoft-com:office:word" xmlns:w="http://schemas.openxmlformats.org/wordprocessingml/2006/main" xmlns:w14="http://schemas.microsoft.com/office/word/2010/wordml" xmlns:w15="http://schemas.microsoft.com/office/word/2012/wordml" xmlns:w16cex="http://schemas.microsoft.com/office/word/2018/wordml/cex" xmlns:w16cid="http://schemas.microsoft.com/office/word/2016/wordml/cid" xmlns:w16="http://schemas.microsoft.com/office/word/2018/wordml" xmlns:w16sdtdh="http://schemas.microsoft.com/office/word/2020/wordml/sdtdatahash" xmlns:w16se="http://schemas.microsoft.com/office/word/2015/wordml/symex" xmlns:wpg="http://schemas.microsoft.com/office/word/2010/wordprocessingGroup" xmlns:wpi="http://schemas.microsoft.com/office/word/2010/wordprocessingInk" xmlns:wne="http://schemas.microsoft.com/office/word/2006/wordml" xmlns:wps="http://schemas.microsoft.com/office/word/2010/wordprocessingShape" mc:Ignorable="w14 w15 w16se w16cid w16 w16cex w16sdtdh wp14">
+<w:endnotes xmlns:wpc="http://schemas.microsoft.com/office/word/2010/wordprocessingCanvas" xmlns:cx="http://schemas.microsoft.com/office/drawing/2014/chartex" xmlns:cx1="http://schemas.microsoft.com/office/drawing/2015/9/8/chartex" xmlns:cx2="http://schemas.microsoft.com/office/drawing/2015/10/21/chartex" xmlns:cx3="http://schemas.microsoft.com/office/drawing/2016/5/9/chartex" xmlns:cx4="http://schemas.microsoft.com/office/drawing/2016/5/10/chartex" xmlns:cx5="http://schemas.microsoft.com/office/drawing/2016/5/11/chartex" xmlns:cx6="http://schemas.microsoft.com/office/drawing/2016/5/12/chartex" xmlns:cx7="http://schemas.microsoft.com/office/drawing/2016/5/13/chartex" xmlns:cx8="http://schemas.microsoft.com/office/drawing/2016/5/14/chartex" xmlns:mc="http://schemas.openxmlformats.org/markup-compatibility/2006" xmlns:aink="http://schemas.microsoft.com/office/drawing/2016/ink" xmlns:am3d="http://schemas.microsoft.com/office/drawing/2017/model3d" xmlns:o="urn:schemas-microsoft-com:office:office" xmlns:oel="http://schemas.microsoft.com/office/2019/extlst" xmlns:r="http://schemas.openxmlformats.org/officeDocument/2006/relationships" xmlns:m="http://schemas.openxmlformats.org/officeDocument/2006/math" xmlns:v="urn:schemas-microsoft-com:vml" xmlns:wp14="http://schemas.microsoft.com/office/word/2010/wordprocessingDrawing" xmlns:wp="http://schemas.openxmlformats.org/drawingml/2006/wordprocessingDrawing" xmlns:w10="urn:schemas-microsoft-com:office:word" xmlns:w="http://schemas.openxmlformats.org/wordprocessingml/2006/main" xmlns:w14="http://schemas.microsoft.com/office/word/2010/wordml" xmlns:w15="http://schemas.microsoft.com/office/word/2012/wordml" xmlns:w16cex="http://schemas.microsoft.com/office/word/2018/wordml/cex" xmlns:w16cid="http://schemas.microsoft.com/office/word/2016/wordml/cid" xmlns:w16="http://schemas.microsoft.com/office/word/2018/wordml" xmlns:w16du="http://schemas.microsoft.com/office/word/2023/wordml/word16du" xmlns:w16sdtdh="http://schemas.microsoft.com/office/word/2020/wordml/sdtdatahash" xmlns:w16sdtfl="http://schemas.microsoft.com/office/word/2024/wordml/sdtformatlock" xmlns:w16se="http://schemas.microsoft.com/office/word/2015/wordml/symex" xmlns:wpg="http://schemas.microsoft.com/office/word/2010/wordprocessingGroup" xmlns:wpi="http://schemas.microsoft.com/office/word/2010/wordprocessingInk" xmlns:wne="http://schemas.microsoft.com/office/word/2006/wordml" xmlns:wps="http://schemas.microsoft.com/office/word/2010/wordprocessingShape" mc:Ignorable="w14 w15 w16se w16cid w16 w16cex w16sdtdh w16sdtfl w16du wp14">
   <w:endnote w:type="separator" w:id="-1">
     <w:p>
       <w:r>
@@ -6611,10 +7138,10 @@
 </file>
 
 <file path=word/footer1.xml><?xml version="1.0" encoding="utf-8"?>
-<w:ftr xmlns:wpc="http://schemas.microsoft.com/office/word/2010/wordprocessingCanvas" xmlns:cx="http://schemas.microsoft.com/office/drawing/2014/chartex" xmlns:cx1="http://schemas.microsoft.com/office/drawing/2015/9/8/chartex" xmlns:cx2="http://schemas.microsoft.com/office/drawing/2015/10/21/chartex" xmlns:cx3="http://schemas.microsoft.com/office/drawing/2016/5/9/chartex" xmlns:cx4="http://schemas.microsoft.com/office/drawing/2016/5/10/chartex" xmlns:cx5="http://schemas.microsoft.com/office/drawing/2016/5/11/chartex" xmlns:cx6="http://schemas.microsoft.com/office/drawing/2016/5/12/chartex" xmlns:cx7="http://schemas.microsoft.com/office/drawing/2016/5/13/chartex" xmlns:cx8="http://schemas.microsoft.com/office/drawing/2016/5/14/chartex" xmlns:mc="http://schemas.openxmlformats.org/markup-compatibility/2006" xmlns:aink="http://schemas.microsoft.com/office/drawing/2016/ink" xmlns:am3d="http://schemas.microsoft.com/office/drawing/2017/model3d" xmlns:o="urn:schemas-microsoft-com:office:office" xmlns:oel="http://schemas.microsoft.com/office/2019/extlst" xmlns:r="http://schemas.openxmlformats.org/officeDocument/2006/relationships" xmlns:m="http://schemas.openxmlformats.org/officeDocument/2006/math" xmlns:v="urn:schemas-microsoft-com:vml" xmlns:wp14="http://schemas.microsoft.com/office/word/2010/wordprocessingDrawing" xmlns:wp="http://schemas.openxmlformats.org/drawingml/2006/wordprocessingDrawing" xmlns:w10="urn:schemas-microsoft-com:office:word" xmlns:w="http://schemas.openxmlformats.org/wordprocessingml/2006/main" xmlns:w14="http://schemas.microsoft.com/office/word/2010/wordml" xmlns:w15="http://schemas.microsoft.com/office/word/2012/wordml" xmlns:w16cex="http://schemas.microsoft.com/office/word/2018/wordml/cex" xmlns:w16cid="http://schemas.microsoft.com/office/word/2016/wordml/cid" xmlns:w16="http://schemas.microsoft.com/office/word/2018/wordml" xmlns:w16sdtdh="http://schemas.microsoft.com/office/word/2020/wordml/sdtdatahash" xmlns:w16se="http://schemas.microsoft.com/office/word/2015/wordml/symex" xmlns:wpg="http://schemas.microsoft.com/office/word/2010/wordprocessingGroup" xmlns:wpi="http://schemas.microsoft.com/office/word/2010/wordprocessingInk" xmlns:wne="http://schemas.microsoft.com/office/word/2006/wordml" xmlns:wps="http://schemas.microsoft.com/office/word/2010/wordprocessingShape" mc:Ignorable="w14 w15 w16se w16cid w16 w16cex w16sdtdh wp14">
+<w:ftr xmlns:wpc="http://schemas.microsoft.com/office/word/2010/wordprocessingCanvas" xmlns:cx="http://schemas.microsoft.com/office/drawing/2014/chartex" xmlns:cx1="http://schemas.microsoft.com/office/drawing/2015/9/8/chartex" xmlns:cx2="http://schemas.microsoft.com/office/drawing/2015/10/21/chartex" xmlns:cx3="http://schemas.microsoft.com/office/drawing/2016/5/9/chartex" xmlns:cx4="http://schemas.microsoft.com/office/drawing/2016/5/10/chartex" xmlns:cx5="http://schemas.microsoft.com/office/drawing/2016/5/11/chartex" xmlns:cx6="http://schemas.microsoft.com/office/drawing/2016/5/12/chartex" xmlns:cx7="http://schemas.microsoft.com/office/drawing/2016/5/13/chartex" xmlns:cx8="http://schemas.microsoft.com/office/drawing/2016/5/14/chartex" xmlns:mc="http://schemas.openxmlformats.org/markup-compatibility/2006" xmlns:aink="http://schemas.microsoft.com/office/drawing/2016/ink" xmlns:am3d="http://schemas.microsoft.com/office/drawing/2017/model3d" xmlns:o="urn:schemas-microsoft-com:office:office" xmlns:oel="http://schemas.microsoft.com/office/2019/extlst" xmlns:r="http://schemas.openxmlformats.org/officeDocument/2006/relationships" xmlns:m="http://schemas.openxmlformats.org/officeDocument/2006/math" xmlns:v="urn:schemas-microsoft-com:vml" xmlns:wp14="http://schemas.microsoft.com/office/word/2010/wordprocessingDrawing" xmlns:wp="http://schemas.openxmlformats.org/drawingml/2006/wordprocessingDrawing" xmlns:w10="urn:schemas-microsoft-com:office:word" xmlns:w="http://schemas.openxmlformats.org/wordprocessingml/2006/main" xmlns:w14="http://schemas.microsoft.com/office/word/2010/wordml" xmlns:w15="http://schemas.microsoft.com/office/word/2012/wordml" xmlns:w16cex="http://schemas.microsoft.com/office/word/2018/wordml/cex" xmlns:w16cid="http://schemas.microsoft.com/office/word/2016/wordml/cid" xmlns:w16="http://schemas.microsoft.com/office/word/2018/wordml" xmlns:w16du="http://schemas.microsoft.com/office/word/2023/wordml/word16du" xmlns:w16sdtdh="http://schemas.microsoft.com/office/word/2020/wordml/sdtdatahash" xmlns:w16sdtfl="http://schemas.microsoft.com/office/word/2024/wordml/sdtformatlock" xmlns:w16se="http://schemas.microsoft.com/office/word/2015/wordml/symex" xmlns:wpg="http://schemas.microsoft.com/office/word/2010/wordprocessingGroup" xmlns:wpi="http://schemas.microsoft.com/office/word/2010/wordprocessingInk" xmlns:wne="http://schemas.microsoft.com/office/word/2006/wordml" xmlns:wps="http://schemas.microsoft.com/office/word/2010/wordprocessingShape" mc:Ignorable="w14 w15 w16se w16cid w16 w16cex w16sdtdh w16sdtfl w16du wp14">
   <w:p>
     <w:pPr>
-      <w:pStyle w:val="Pieddepage"/>
+      <w:pStyle w:val="Footer"/>
     </w:pPr>
     <w:r>
       <w:rPr>
@@ -6623,7 +7150,7 @@
       <mc:AlternateContent>
         <mc:Choice Requires="wps">
           <w:drawing>
-            <wp:anchor distT="0" distB="0" distL="0" distR="0" simplePos="0" relativeHeight="23" behindDoc="0" locked="0" layoutInCell="1" allowOverlap="1">
+            <wp:anchor distT="0" distB="0" distL="0" distR="0" simplePos="0" relativeHeight="23" behindDoc="0" locked="0" layoutInCell="1" allowOverlap="1" wp14:anchorId="7CBC18D8" wp14:editId="57121672">
               <wp:simplePos x="0" y="0"/>
               <wp:positionH relativeFrom="margin">
                 <wp:align>center</wp:align>
@@ -6658,11 +7185,11 @@
                       <w:txbxContent>
                         <w:p>
                           <w:pPr>
-                            <w:pStyle w:val="Pieddepage"/>
+                            <w:pStyle w:val="Footer"/>
                           </w:pPr>
                           <w:r>
                             <w:rPr>
-                              <w:rStyle w:val="Numrodepage"/>
+                              <w:rStyle w:val="PageNumber"/>
                             </w:rPr>
                             <w:fldChar w:fldCharType="begin"/>
                           </w:r>
@@ -6734,7 +7261,7 @@
 </file>
 
 <file path=word/footnotes.xml><?xml version="1.0" encoding="utf-8"?>
-<w:footnotes xmlns:wpc="http://schemas.microsoft.com/office/word/2010/wordprocessingCanvas" xmlns:cx="http://schemas.microsoft.com/office/drawing/2014/chartex" xmlns:cx1="http://schemas.microsoft.com/office/drawing/2015/9/8/chartex" xmlns:cx2="http://schemas.microsoft.com/office/drawing/2015/10/21/chartex" xmlns:cx3="http://schemas.microsoft.com/office/drawing/2016/5/9/chartex" xmlns:cx4="http://schemas.microsoft.com/office/drawing/2016/5/10/chartex" xmlns:cx5="http://schemas.microsoft.com/office/drawing/2016/5/11/chartex" xmlns:cx6="http://schemas.microsoft.com/office/drawing/2016/5/12/chartex" xmlns:cx7="http://schemas.microsoft.com/office/drawing/2016/5/13/chartex" xmlns:cx8="http://schemas.microsoft.com/office/drawing/2016/5/14/chartex" xmlns:mc="http://schemas.openxmlformats.org/markup-compatibility/2006" xmlns:aink="http://schemas.microsoft.com/office/drawing/2016/ink" xmlns:am3d="http://schemas.microsoft.com/office/drawing/2017/model3d" xmlns:o="urn:schemas-microsoft-com:office:office" xmlns:oel="http://schemas.microsoft.com/office/2019/extlst" xmlns:r="http://schemas.openxmlformats.org/officeDocument/2006/relationships" xmlns:m="http://schemas.openxmlformats.org/officeDocument/2006/math" xmlns:v="urn:schemas-microsoft-com:vml" xmlns:wp14="http://schemas.microsoft.com/office/word/2010/wordprocessingDrawing" xmlns:wp="http://schemas.openxmlformats.org/drawingml/2006/wordprocessingDrawing" xmlns:w10="urn:schemas-microsoft-com:office:word" xmlns:w="http://schemas.openxmlformats.org/wordprocessingml/2006/main" xmlns:w14="http://schemas.microsoft.com/office/word/2010/wordml" xmlns:w15="http://schemas.microsoft.com/office/word/2012/wordml" xmlns:w16cex="http://schemas.microsoft.com/office/word/2018/wordml/cex" xmlns:w16cid="http://schemas.microsoft.com/office/word/2016/wordml/cid" xmlns:w16="http://schemas.microsoft.com/office/word/2018/wordml" xmlns:w16sdtdh="http://schemas.microsoft.com/office/word/2020/wordml/sdtdatahash" xmlns:w16se="http://schemas.microsoft.com/office/word/2015/wordml/symex" xmlns:wpg="http://schemas.microsoft.com/office/word/2010/wordprocessingGroup" xmlns:wpi="http://schemas.microsoft.com/office/word/2010/wordprocessingInk" xmlns:wne="http://schemas.microsoft.com/office/word/2006/wordml" xmlns:wps="http://schemas.microsoft.com/office/word/2010/wordprocessingShape" mc:Ignorable="w14 w15 w16se w16cid w16 w16cex w16sdtdh wp14">
+<w:footnotes xmlns:wpc="http://schemas.microsoft.com/office/word/2010/wordprocessingCanvas" xmlns:cx="http://schemas.microsoft.com/office/drawing/2014/chartex" xmlns:cx1="http://schemas.microsoft.com/office/drawing/2015/9/8/chartex" xmlns:cx2="http://schemas.microsoft.com/office/drawing/2015/10/21/chartex" xmlns:cx3="http://schemas.microsoft.com/office/drawing/2016/5/9/chartex" xmlns:cx4="http://schemas.microsoft.com/office/drawing/2016/5/10/chartex" xmlns:cx5="http://schemas.microsoft.com/office/drawing/2016/5/11/chartex" xmlns:cx6="http://schemas.microsoft.com/office/drawing/2016/5/12/chartex" xmlns:cx7="http://schemas.microsoft.com/office/drawing/2016/5/13/chartex" xmlns:cx8="http://schemas.microsoft.com/office/drawing/2016/5/14/chartex" xmlns:mc="http://schemas.openxmlformats.org/markup-compatibility/2006" xmlns:aink="http://schemas.microsoft.com/office/drawing/2016/ink" xmlns:am3d="http://schemas.microsoft.com/office/drawing/2017/model3d" xmlns:o="urn:schemas-microsoft-com:office:office" xmlns:oel="http://schemas.microsoft.com/office/2019/extlst" xmlns:r="http://schemas.openxmlformats.org/officeDocument/2006/relationships" xmlns:m="http://schemas.openxmlformats.org/officeDocument/2006/math" xmlns:v="urn:schemas-microsoft-com:vml" xmlns:wp14="http://schemas.microsoft.com/office/word/2010/wordprocessingDrawing" xmlns:wp="http://schemas.openxmlformats.org/drawingml/2006/wordprocessingDrawing" xmlns:w10="urn:schemas-microsoft-com:office:word" xmlns:w="http://schemas.openxmlformats.org/wordprocessingml/2006/main" xmlns:w14="http://schemas.microsoft.com/office/word/2010/wordml" xmlns:w15="http://schemas.microsoft.com/office/word/2012/wordml" xmlns:w16cex="http://schemas.microsoft.com/office/word/2018/wordml/cex" xmlns:w16cid="http://schemas.microsoft.com/office/word/2016/wordml/cid" xmlns:w16="http://schemas.microsoft.com/office/word/2018/wordml" xmlns:w16du="http://schemas.microsoft.com/office/word/2023/wordml/word16du" xmlns:w16sdtdh="http://schemas.microsoft.com/office/word/2020/wordml/sdtdatahash" xmlns:w16sdtfl="http://schemas.microsoft.com/office/word/2024/wordml/sdtformatlock" xmlns:w16se="http://schemas.microsoft.com/office/word/2015/wordml/symex" xmlns:wpg="http://schemas.microsoft.com/office/word/2010/wordprocessingGroup" xmlns:wpi="http://schemas.microsoft.com/office/word/2010/wordprocessingInk" xmlns:wne="http://schemas.microsoft.com/office/word/2006/wordml" xmlns:wps="http://schemas.microsoft.com/office/word/2010/wordprocessingShape" mc:Ignorable="w14 w15 w16se w16cid w16 w16cex w16sdtdh w16sdtfl w16du wp14">
   <w:footnote w:type="separator" w:id="-1">
     <w:p>
       <w:r>
@@ -6752,17 +7279,17 @@
   <w:footnote w:id="1">
     <w:p>
       <w:pPr>
-        <w:pStyle w:val="Notedebasdepage"/>
-      </w:pPr>
-      <w:r>
-        <w:rPr>
-          <w:rStyle w:val="Appelnotedebasdep"/>
+        <w:pStyle w:val="FootnoteText"/>
+      </w:pPr>
+      <w:r>
+        <w:rPr>
+          <w:rStyle w:val="FootnoteReference"/>
         </w:rPr>
         <w:footnoteRef/>
       </w:r>
       <w:r>
         <w:rPr>
-          <w:rStyle w:val="Appelnotedebasdep"/>
+          <w:rStyle w:val="FootnoteReference"/>
         </w:rPr>
         <w:tab/>
       </w:r>
@@ -6780,83 +7307,67 @@
   <w:footnote w:id="2">
     <w:p>
       <w:pPr>
-        <w:pStyle w:val="Notedebasdepage"/>
-      </w:pPr>
-      <w:r>
-        <w:rPr>
-          <w:rStyle w:val="Appelnotedebasdep"/>
+        <w:pStyle w:val="FootnoteText"/>
+      </w:pPr>
+      <w:r>
+        <w:rPr>
+          <w:rStyle w:val="FootnoteReference"/>
         </w:rPr>
         <w:footnoteRef/>
       </w:r>
       <w:r>
         <w:rPr>
-          <w:rStyle w:val="Appelnotedebasdep"/>
+          <w:rStyle w:val="FootnoteReference"/>
         </w:rPr>
         <w:tab/>
       </w:r>
       <w:r>
         <w:t xml:space="preserve"> </w:t>
       </w:r>
-      <w:hyperlink r:id="rId1" w:history="1">
-        <w:r>
-          <w:rPr>
-            <w:rStyle w:val="Hyperlien"/>
-          </w:rPr>
-          <w:t>http://www.adass.org/instructions/ADASS2019.tar</w:t>
-        </w:r>
-      </w:hyperlink>
-      <w:r>
-        <w:rPr>
-          <w:i/>
-        </w:rPr>
-        <w:t xml:space="preserve"> </w:t>
+      <w:r>
+        <w:t>https://pages.astro.umd.edu/~teuben/adass2025/ADASS2025.tar</w:t>
       </w:r>
     </w:p>
   </w:footnote>
   <w:footnote w:id="3">
     <w:p>
       <w:pPr>
-        <w:pStyle w:val="Notedebasdepage"/>
-      </w:pPr>
-      <w:r>
-        <w:rPr>
-          <w:rStyle w:val="Appelnotedebasdep"/>
+        <w:pStyle w:val="FootnoteText"/>
+      </w:pPr>
+      <w:r>
+        <w:rPr>
+          <w:rStyle w:val="FootnoteReference"/>
         </w:rPr>
         <w:footnoteRef/>
       </w:r>
       <w:r>
         <w:rPr>
-          <w:rStyle w:val="Appelnotedebasdep"/>
+          <w:rStyle w:val="FootnoteReference"/>
         </w:rPr>
         <w:tab/>
       </w:r>
       <w:r>
         <w:t xml:space="preserve"> </w:t>
       </w:r>
-      <w:hyperlink r:id="rId2">
-        <w:r>
-          <w:rPr>
-            <w:rStyle w:val="InternetLink"/>
-          </w:rPr>
-          <w:t>http://www.adass.org/instructions/ADASS2019.tar</w:t>
-        </w:r>
-      </w:hyperlink>
+      <w:r>
+        <w:t>https://pages.astro.umd.edu/~teuben/adass2025/ADASS2025.tar</w:t>
+      </w:r>
     </w:p>
   </w:footnote>
   <w:footnote w:id="4">
     <w:p>
       <w:pPr>
-        <w:pStyle w:val="Notedebasdepage"/>
-      </w:pPr>
-      <w:r>
-        <w:rPr>
-          <w:rStyle w:val="Appelnotedebasdep"/>
+        <w:pStyle w:val="FootnoteText"/>
+      </w:pPr>
+      <w:r>
+        <w:rPr>
+          <w:rStyle w:val="FootnoteReference"/>
         </w:rPr>
         <w:footnoteRef/>
       </w:r>
       <w:r>
         <w:rPr>
-          <w:rStyle w:val="Appelnotedebasdep"/>
+          <w:rStyle w:val="FootnoteReference"/>
         </w:rPr>
         <w:tab/>
       </w:r>
@@ -6868,17 +7379,17 @@
   <w:footnote w:id="5">
     <w:p>
       <w:pPr>
-        <w:pStyle w:val="Notedebasdepage"/>
-      </w:pPr>
-      <w:r>
-        <w:rPr>
-          <w:rStyle w:val="Appelnotedebasdep"/>
+        <w:pStyle w:val="FootnoteText"/>
+      </w:pPr>
+      <w:r>
+        <w:rPr>
+          <w:rStyle w:val="FootnoteReference"/>
         </w:rPr>
         <w:footnoteRef/>
       </w:r>
       <w:r>
         <w:rPr>
-          <w:rStyle w:val="Appelnotedebasdep"/>
+          <w:rStyle w:val="FootnoteReference"/>
         </w:rPr>
         <w:tab/>
       </w:r>
@@ -6890,17 +7401,17 @@
   <w:footnote w:id="6">
     <w:p>
       <w:pPr>
-        <w:pStyle w:val="Notedebasdepage"/>
-      </w:pPr>
-      <w:r>
-        <w:rPr>
-          <w:rStyle w:val="Appelnotedebasdep"/>
+        <w:pStyle w:val="FootnoteText"/>
+      </w:pPr>
+      <w:r>
+        <w:rPr>
+          <w:rStyle w:val="FootnoteReference"/>
         </w:rPr>
         <w:footnoteRef/>
       </w:r>
       <w:r>
         <w:rPr>
-          <w:rStyle w:val="Appelnotedebasdep"/>
+          <w:rStyle w:val="FootnoteReference"/>
         </w:rPr>
         <w:tab/>
       </w:r>
@@ -6918,61 +7429,39 @@
   <w:footnote w:id="7">
     <w:p>
       <w:pPr>
-        <w:pStyle w:val="Notedebasdepage"/>
-      </w:pPr>
-      <w:r>
-        <w:rPr>
-          <w:rStyle w:val="Appelnotedebasdep"/>
+        <w:pStyle w:val="FootnoteText"/>
+      </w:pPr>
+      <w:r>
+        <w:rPr>
+          <w:rStyle w:val="FootnoteReference"/>
         </w:rPr>
         <w:footnoteRef/>
       </w:r>
       <w:r>
         <w:rPr>
-          <w:rStyle w:val="Appelnotedebasdep"/>
+          <w:rStyle w:val="FootnoteReference"/>
         </w:rPr>
         <w:tab/>
       </w:r>
       <w:r>
-        <w:t xml:space="preserve"> https://www.lemkesoft.de/en/products/graphicconverter/</w:t>
+        <w:t xml:space="preserve"> The British are often inconsistent here. You see both David Lloyd-George and David Lloyd George. Sacha Baron Cohen does not use the hyphen, but his brother, Simon Baron-Cohen does.</w:t>
       </w:r>
     </w:p>
   </w:footnote>
   <w:footnote w:id="8">
     <w:p>
       <w:pPr>
-        <w:pStyle w:val="Notedebasdepage"/>
-      </w:pPr>
-      <w:r>
-        <w:rPr>
-          <w:rStyle w:val="Appelnotedebasdep"/>
+        <w:pStyle w:val="FootnoteText"/>
+      </w:pPr>
+      <w:r>
+        <w:rPr>
+          <w:rStyle w:val="FootnoteReference"/>
         </w:rPr>
         <w:footnoteRef/>
       </w:r>
       <w:r>
         <w:rPr>
-          <w:rStyle w:val="Appelnotedebasdep"/>
-        </w:rPr>
-        <w:tab/>
-      </w:r>
-      <w:r>
-        <w:t xml:space="preserve"> The British are often inconsistent here. You see both David Lloyd-George and David Lloyd George. Sacha Baron Cohen does not use the hyphen, but his brother, Simon Baron-Cohen does.</w:t>
-      </w:r>
-    </w:p>
-  </w:footnote>
-  <w:footnote w:id="9">
-    <w:p>
-      <w:pPr>
-        <w:pStyle w:val="Notedebasdepage"/>
-      </w:pPr>
-      <w:r>
-        <w:rPr>
-          <w:rStyle w:val="Appelnotedebasdep"/>
-        </w:rPr>
-        <w:footnoteRef/>
-      </w:r>
-      <w:r>
-        <w:rPr>
-          <w:rStyle w:val="Appelnotedebasdep"/>
+          <w:rStyle w:val="FootnoteReference"/>
         </w:rPr>
         <w:tab/>
       </w:r>
@@ -6985,7 +7474,7 @@
 </file>
 
 <file path=word/numbering.xml><?xml version="1.0" encoding="utf-8"?>
-<w:numbering xmlns:wpc="http://schemas.microsoft.com/office/word/2010/wordprocessingCanvas" xmlns:cx="http://schemas.microsoft.com/office/drawing/2014/chartex" xmlns:cx1="http://schemas.microsoft.com/office/drawing/2015/9/8/chartex" xmlns:cx2="http://schemas.microsoft.com/office/drawing/2015/10/21/chartex" xmlns:cx3="http://schemas.microsoft.com/office/drawing/2016/5/9/chartex" xmlns:cx4="http://schemas.microsoft.com/office/drawing/2016/5/10/chartex" xmlns:cx5="http://schemas.microsoft.com/office/drawing/2016/5/11/chartex" xmlns:cx6="http://schemas.microsoft.com/office/drawing/2016/5/12/chartex" xmlns:cx7="http://schemas.microsoft.com/office/drawing/2016/5/13/chartex" xmlns:cx8="http://schemas.microsoft.com/office/drawing/2016/5/14/chartex" xmlns:mc="http://schemas.openxmlformats.org/markup-compatibility/2006" xmlns:aink="http://schemas.microsoft.com/office/drawing/2016/ink" xmlns:am3d="http://schemas.microsoft.com/office/drawing/2017/model3d" xmlns:o="urn:schemas-microsoft-com:office:office" xmlns:oel="http://schemas.microsoft.com/office/2019/extlst" xmlns:r="http://schemas.openxmlformats.org/officeDocument/2006/relationships" xmlns:m="http://schemas.openxmlformats.org/officeDocument/2006/math" xmlns:v="urn:schemas-microsoft-com:vml" xmlns:wp14="http://schemas.microsoft.com/office/word/2010/wordprocessingDrawing" xmlns:wp="http://schemas.openxmlformats.org/drawingml/2006/wordprocessingDrawing" xmlns:w10="urn:schemas-microsoft-com:office:word" xmlns:w="http://schemas.openxmlformats.org/wordprocessingml/2006/main" xmlns:w14="http://schemas.microsoft.com/office/word/2010/wordml" xmlns:w15="http://schemas.microsoft.com/office/word/2012/wordml" xmlns:w16cex="http://schemas.microsoft.com/office/word/2018/wordml/cex" xmlns:w16cid="http://schemas.microsoft.com/office/word/2016/wordml/cid" xmlns:w16="http://schemas.microsoft.com/office/word/2018/wordml" xmlns:w16sdtdh="http://schemas.microsoft.com/office/word/2020/wordml/sdtdatahash" xmlns:w16se="http://schemas.microsoft.com/office/word/2015/wordml/symex" xmlns:wpg="http://schemas.microsoft.com/office/word/2010/wordprocessingGroup" xmlns:wpi="http://schemas.microsoft.com/office/word/2010/wordprocessingInk" xmlns:wne="http://schemas.microsoft.com/office/word/2006/wordml" xmlns:wps="http://schemas.microsoft.com/office/word/2010/wordprocessingShape" mc:Ignorable="w14 w15 w16se w16cid w16 w16cex w16sdtdh wp14">
+<w:numbering xmlns:wpc="http://schemas.microsoft.com/office/word/2010/wordprocessingCanvas" xmlns:cx="http://schemas.microsoft.com/office/drawing/2014/chartex" xmlns:cx1="http://schemas.microsoft.com/office/drawing/2015/9/8/chartex" xmlns:cx2="http://schemas.microsoft.com/office/drawing/2015/10/21/chartex" xmlns:cx3="http://schemas.microsoft.com/office/drawing/2016/5/9/chartex" xmlns:cx4="http://schemas.microsoft.com/office/drawing/2016/5/10/chartex" xmlns:cx5="http://schemas.microsoft.com/office/drawing/2016/5/11/chartex" xmlns:cx6="http://schemas.microsoft.com/office/drawing/2016/5/12/chartex" xmlns:cx7="http://schemas.microsoft.com/office/drawing/2016/5/13/chartex" xmlns:cx8="http://schemas.microsoft.com/office/drawing/2016/5/14/chartex" xmlns:mc="http://schemas.openxmlformats.org/markup-compatibility/2006" xmlns:aink="http://schemas.microsoft.com/office/drawing/2016/ink" xmlns:am3d="http://schemas.microsoft.com/office/drawing/2017/model3d" xmlns:o="urn:schemas-microsoft-com:office:office" xmlns:oel="http://schemas.microsoft.com/office/2019/extlst" xmlns:r="http://schemas.openxmlformats.org/officeDocument/2006/relationships" xmlns:m="http://schemas.openxmlformats.org/officeDocument/2006/math" xmlns:v="urn:schemas-microsoft-com:vml" xmlns:wp14="http://schemas.microsoft.com/office/word/2010/wordprocessingDrawing" xmlns:wp="http://schemas.openxmlformats.org/drawingml/2006/wordprocessingDrawing" xmlns:w10="urn:schemas-microsoft-com:office:word" xmlns:w="http://schemas.openxmlformats.org/wordprocessingml/2006/main" xmlns:w14="http://schemas.microsoft.com/office/word/2010/wordml" xmlns:w15="http://schemas.microsoft.com/office/word/2012/wordml" xmlns:w16cex="http://schemas.microsoft.com/office/word/2018/wordml/cex" xmlns:w16cid="http://schemas.microsoft.com/office/word/2016/wordml/cid" xmlns:w16="http://schemas.microsoft.com/office/word/2018/wordml" xmlns:w16du="http://schemas.microsoft.com/office/word/2023/wordml/word16du" xmlns:w16sdtdh="http://schemas.microsoft.com/office/word/2020/wordml/sdtdatahash" xmlns:w16sdtfl="http://schemas.microsoft.com/office/word/2024/wordml/sdtformatlock" xmlns:w16se="http://schemas.microsoft.com/office/word/2015/wordml/symex" xmlns:wpg="http://schemas.microsoft.com/office/word/2010/wordprocessingGroup" xmlns:wpi="http://schemas.microsoft.com/office/word/2010/wordprocessingInk" xmlns:wne="http://schemas.microsoft.com/office/word/2006/wordml" xmlns:wps="http://schemas.microsoft.com/office/word/2010/wordprocessingShape" mc:Ignorable="w14 w15 w16se w16cid w16 w16cex w16sdtdh w16sdtfl w16du wp14">
   <w:abstractNum w:abstractNumId="0" w15:restartNumberingAfterBreak="0">
     <w:nsid w:val="246B5AC8"/>
     <w:multiLevelType w:val="multilevel"/>
@@ -7579,7 +8068,7 @@
 </file>
 
 <file path=word/styles.xml><?xml version="1.0" encoding="utf-8"?>
-<w:styles xmlns:mc="http://schemas.openxmlformats.org/markup-compatibility/2006" xmlns:r="http://schemas.openxmlformats.org/officeDocument/2006/relationships" xmlns:w="http://schemas.openxmlformats.org/wordprocessingml/2006/main" xmlns:w14="http://schemas.microsoft.com/office/word/2010/wordml" xmlns:w15="http://schemas.microsoft.com/office/word/2012/wordml" xmlns:w16cex="http://schemas.microsoft.com/office/word/2018/wordml/cex" xmlns:w16cid="http://schemas.microsoft.com/office/word/2016/wordml/cid" xmlns:w16="http://schemas.microsoft.com/office/word/2018/wordml" xmlns:w16sdtdh="http://schemas.microsoft.com/office/word/2020/wordml/sdtdatahash" xmlns:w16se="http://schemas.microsoft.com/office/word/2015/wordml/symex" mc:Ignorable="w14 w15 w16se w16cid w16 w16cex w16sdtdh">
+<w:styles xmlns:mc="http://schemas.openxmlformats.org/markup-compatibility/2006" xmlns:r="http://schemas.openxmlformats.org/officeDocument/2006/relationships" xmlns:w="http://schemas.openxmlformats.org/wordprocessingml/2006/main" xmlns:w14="http://schemas.microsoft.com/office/word/2010/wordml" xmlns:w15="http://schemas.microsoft.com/office/word/2012/wordml" xmlns:w16cex="http://schemas.microsoft.com/office/word/2018/wordml/cex" xmlns:w16cid="http://schemas.microsoft.com/office/word/2016/wordml/cid" xmlns:w16="http://schemas.microsoft.com/office/word/2018/wordml" xmlns:w16du="http://schemas.microsoft.com/office/word/2023/wordml/word16du" xmlns:w16sdtdh="http://schemas.microsoft.com/office/word/2020/wordml/sdtdatahash" xmlns:w16sdtfl="http://schemas.microsoft.com/office/word/2024/wordml/sdtformatlock" xmlns:w16se="http://schemas.microsoft.com/office/word/2015/wordml/symex" mc:Ignorable="w14 w15 w16se w16cid w16 w16cex w16sdtdh w16sdtfl w16du">
   <w:docDefaults>
     <w:rPrDefault>
       <w:rPr>
@@ -7695,6 +8184,7 @@
     <w:lsdException w:name="HTML Sample" w:semiHidden="1" w:unhideWhenUsed="1"/>
     <w:lsdException w:name="HTML Typewriter" w:semiHidden="1" w:unhideWhenUsed="1"/>
     <w:lsdException w:name="HTML Variable" w:semiHidden="1" w:unhideWhenUsed="1"/>
+    <w:lsdException w:name="Normal Table" w:semiHidden="1" w:unhideWhenUsed="1"/>
     <w:lsdException w:name="annotation subject" w:semiHidden="1" w:unhideWhenUsed="1"/>
     <w:lsdException w:name="No List" w:semiHidden="1" w:unhideWhenUsed="1"/>
     <w:lsdException w:name="Outline List 1" w:semiHidden="1" w:unhideWhenUsed="1"/>
@@ -7741,8 +8231,10 @@
     <w:lsdException w:name="Table Subtle 2" w:semiHidden="1" w:unhideWhenUsed="1"/>
     <w:lsdException w:name="Table Web 1" w:semiHidden="1" w:unhideWhenUsed="1"/>
     <w:lsdException w:name="Table Web 2" w:semiHidden="1" w:unhideWhenUsed="1"/>
+    <w:lsdException w:name="Table Web 3" w:semiHidden="1" w:unhideWhenUsed="1"/>
     <w:lsdException w:name="Balloon Text" w:semiHidden="1" w:unhideWhenUsed="1"/>
     <w:lsdException w:name="Table Grid" w:uiPriority="59"/>
+    <w:lsdException w:name="Table Theme" w:semiHidden="1" w:unhideWhenUsed="1"/>
     <w:lsdException w:name="Placeholder Text" w:semiHidden="1"/>
     <w:lsdException w:name="No Spacing" w:semiHidden="1" w:uiPriority="1" w:qFormat="1"/>
     <w:lsdException w:name="Light Shading" w:uiPriority="60"/>
@@ -7971,11 +8463,11 @@
       <w:szCs w:val="24"/>
     </w:rPr>
   </w:style>
-  <w:style w:type="paragraph" w:styleId="Titre1">
+  <w:style w:type="paragraph" w:styleId="Heading1">
     <w:name w:val="heading 1"/>
     <w:basedOn w:val="Normal"/>
     <w:next w:val="Normal"/>
-    <w:link w:val="Titre1Car"/>
+    <w:link w:val="Heading1Char"/>
     <w:uiPriority w:val="9"/>
     <w:qFormat/>
     <w:rsid w:val="009E323E"/>
@@ -7994,11 +8486,11 @@
       <w:szCs w:val="32"/>
     </w:rPr>
   </w:style>
-  <w:style w:type="paragraph" w:styleId="Titre2">
+  <w:style w:type="paragraph" w:styleId="Heading2">
     <w:name w:val="heading 2"/>
     <w:basedOn w:val="Normal"/>
     <w:next w:val="Normal"/>
-    <w:link w:val="Titre2Car"/>
+    <w:link w:val="Heading2Char"/>
     <w:uiPriority w:val="9"/>
     <w:unhideWhenUsed/>
     <w:qFormat/>
@@ -8016,13 +8508,13 @@
       <w:szCs w:val="26"/>
     </w:rPr>
   </w:style>
-  <w:style w:type="character" w:default="1" w:styleId="Policepardfaut">
+  <w:style w:type="character" w:default="1" w:styleId="DefaultParagraphFont">
     <w:name w:val="Default Paragraph Font"/>
     <w:uiPriority w:val="1"/>
     <w:semiHidden/>
     <w:unhideWhenUsed/>
   </w:style>
-  <w:style w:type="table" w:default="1" w:styleId="TableauNormal">
+  <w:style w:type="table" w:default="1" w:styleId="TableNormal">
     <w:name w:val="Normal Table"/>
     <w:uiPriority w:val="99"/>
     <w:semiHidden/>
@@ -8037,16 +8529,16 @@
       </w:tblCellMar>
     </w:tblPr>
   </w:style>
-  <w:style w:type="numbering" w:default="1" w:styleId="Aucuneliste">
+  <w:style w:type="numbering" w:default="1" w:styleId="NoList">
     <w:name w:val="No List"/>
     <w:uiPriority w:val="99"/>
     <w:semiHidden/>
     <w:unhideWhenUsed/>
   </w:style>
-  <w:style w:type="character" w:customStyle="1" w:styleId="Titre1Car">
-    <w:name w:val="Titre 1 Car"/>
-    <w:basedOn w:val="Policepardfaut"/>
-    <w:link w:val="Titre1"/>
+  <w:style w:type="character" w:customStyle="1" w:styleId="Heading1Char">
+    <w:name w:val="Heading 1 Char"/>
+    <w:basedOn w:val="DefaultParagraphFont"/>
+    <w:link w:val="Heading1"/>
     <w:uiPriority w:val="9"/>
     <w:qFormat/>
     <w:rsid w:val="009E323E"/>
@@ -8059,10 +8551,10 @@
       <w:szCs w:val="32"/>
     </w:rPr>
   </w:style>
-  <w:style w:type="character" w:customStyle="1" w:styleId="NotedebasdepageCar">
-    <w:name w:val="Note de bas de page Car"/>
-    <w:basedOn w:val="Policepardfaut"/>
-    <w:link w:val="Notedebasdepage"/>
+  <w:style w:type="character" w:customStyle="1" w:styleId="FootnoteTextChar">
+    <w:name w:val="Footnote Text Char"/>
+    <w:basedOn w:val="DefaultParagraphFont"/>
+    <w:link w:val="FootnoteText"/>
     <w:uiPriority w:val="99"/>
     <w:qFormat/>
     <w:rsid w:val="009E323E"/>
@@ -8070,9 +8562,9 @@
       <w:szCs w:val="24"/>
     </w:rPr>
   </w:style>
-  <w:style w:type="character" w:styleId="Appelnotedebasdep">
+  <w:style w:type="character" w:styleId="FootnoteReference">
     <w:name w:val="footnote reference"/>
-    <w:basedOn w:val="Policepardfaut"/>
+    <w:basedOn w:val="DefaultParagraphFont"/>
     <w:uiPriority w:val="99"/>
     <w:unhideWhenUsed/>
     <w:qFormat/>
@@ -8083,7 +8575,7 @@
   </w:style>
   <w:style w:type="character" w:customStyle="1" w:styleId="InternetLink">
     <w:name w:val="Internet Link"/>
-    <w:basedOn w:val="Policepardfaut"/>
+    <w:basedOn w:val="DefaultParagraphFont"/>
     <w:uiPriority w:val="99"/>
     <w:unhideWhenUsed/>
     <w:rsid w:val="009E323E"/>
@@ -8092,10 +8584,10 @@
       <w:u w:val="single"/>
     </w:rPr>
   </w:style>
-  <w:style w:type="character" w:customStyle="1" w:styleId="TitreCar">
-    <w:name w:val="Titre Car"/>
-    <w:basedOn w:val="Policepardfaut"/>
-    <w:link w:val="Titre"/>
+  <w:style w:type="character" w:customStyle="1" w:styleId="TitleChar">
+    <w:name w:val="Title Char"/>
+    <w:basedOn w:val="DefaultParagraphFont"/>
+    <w:link w:val="Title"/>
     <w:uiPriority w:val="10"/>
     <w:qFormat/>
     <w:rsid w:val="00934C38"/>
@@ -8107,9 +8599,9 @@
       <w:szCs w:val="52"/>
     </w:rPr>
   </w:style>
-  <w:style w:type="character" w:styleId="Lienvisit">
+  <w:style w:type="character" w:styleId="FollowedHyperlink">
     <w:name w:val="FollowedHyperlink"/>
-    <w:basedOn w:val="Policepardfaut"/>
+    <w:basedOn w:val="DefaultParagraphFont"/>
     <w:uiPriority w:val="99"/>
     <w:semiHidden/>
     <w:unhideWhenUsed/>
@@ -8120,10 +8612,10 @@
       <w:u w:val="single"/>
     </w:rPr>
   </w:style>
-  <w:style w:type="character" w:customStyle="1" w:styleId="Titre2Car">
-    <w:name w:val="Titre 2 Car"/>
-    <w:basedOn w:val="Policepardfaut"/>
-    <w:link w:val="Titre2"/>
+  <w:style w:type="character" w:customStyle="1" w:styleId="Heading2Char">
+    <w:name w:val="Heading 2 Char"/>
+    <w:basedOn w:val="DefaultParagraphFont"/>
+    <w:link w:val="Heading2"/>
     <w:uiPriority w:val="9"/>
     <w:qFormat/>
     <w:rsid w:val="0003109D"/>
@@ -8136,14 +8628,14 @@
   </w:style>
   <w:style w:type="character" w:customStyle="1" w:styleId="s1">
     <w:name w:val="s1"/>
-    <w:basedOn w:val="Policepardfaut"/>
+    <w:basedOn w:val="DefaultParagraphFont"/>
     <w:qFormat/>
     <w:rsid w:val="008434A7"/>
   </w:style>
-  <w:style w:type="character" w:customStyle="1" w:styleId="En-tteCar">
-    <w:name w:val="En-tête Car"/>
-    <w:basedOn w:val="Policepardfaut"/>
-    <w:link w:val="En-tte"/>
+  <w:style w:type="character" w:customStyle="1" w:styleId="HeaderChar">
+    <w:name w:val="Header Char"/>
+    <w:basedOn w:val="DefaultParagraphFont"/>
+    <w:link w:val="Header"/>
     <w:uiPriority w:val="99"/>
     <w:qFormat/>
     <w:rsid w:val="00A272CF"/>
@@ -8152,10 +8644,10 @@
       <w:szCs w:val="24"/>
     </w:rPr>
   </w:style>
-  <w:style w:type="character" w:customStyle="1" w:styleId="PieddepageCar">
-    <w:name w:val="Pied de page Car"/>
-    <w:basedOn w:val="Policepardfaut"/>
-    <w:link w:val="Pieddepage"/>
+  <w:style w:type="character" w:customStyle="1" w:styleId="FooterChar">
+    <w:name w:val="Footer Char"/>
+    <w:basedOn w:val="DefaultParagraphFont"/>
+    <w:link w:val="Footer"/>
     <w:uiPriority w:val="99"/>
     <w:qFormat/>
     <w:rsid w:val="00A272CF"/>
@@ -8164,9 +8656,9 @@
       <w:szCs w:val="24"/>
     </w:rPr>
   </w:style>
-  <w:style w:type="character" w:styleId="Numrodepage">
+  <w:style w:type="character" w:styleId="PageNumber">
     <w:name w:val="page number"/>
-    <w:basedOn w:val="Policepardfaut"/>
+    <w:basedOn w:val="DefaultParagraphFont"/>
     <w:uiPriority w:val="99"/>
     <w:semiHidden/>
     <w:unhideWhenUsed/>
@@ -8280,7 +8772,7 @@
   <w:style w:type="paragraph" w:customStyle="1" w:styleId="Heading">
     <w:name w:val="Heading"/>
     <w:basedOn w:val="Normal"/>
-    <w:next w:val="Corpsdetexte"/>
+    <w:next w:val="BodyText"/>
     <w:qFormat/>
     <w:pPr>
       <w:keepNext/>
@@ -8292,21 +8784,21 @@
       <w:szCs w:val="28"/>
     </w:rPr>
   </w:style>
-  <w:style w:type="paragraph" w:styleId="Corpsdetexte">
+  <w:style w:type="paragraph" w:styleId="BodyText">
     <w:name w:val="Body Text"/>
     <w:basedOn w:val="Normal"/>
     <w:pPr>
       <w:spacing w:after="140" w:line="288" w:lineRule="auto"/>
     </w:pPr>
   </w:style>
-  <w:style w:type="paragraph" w:styleId="Liste">
+  <w:style w:type="paragraph" w:styleId="List">
     <w:name w:val="List"/>
-    <w:basedOn w:val="Corpsdetexte"/>
+    <w:basedOn w:val="BodyText"/>
     <w:rPr>
       <w:rFonts w:cs="FreeSans"/>
     </w:rPr>
   </w:style>
-  <w:style w:type="paragraph" w:styleId="Lgende">
+  <w:style w:type="paragraph" w:styleId="Caption">
     <w:name w:val="caption"/>
     <w:basedOn w:val="Normal"/>
     <w:qFormat/>
@@ -8331,16 +8823,16 @@
       <w:rFonts w:cs="FreeSans"/>
     </w:rPr>
   </w:style>
-  <w:style w:type="paragraph" w:styleId="Notedebasdepage">
+  <w:style w:type="paragraph" w:styleId="FootnoteText">
     <w:name w:val="footnote text"/>
     <w:basedOn w:val="Normal"/>
-    <w:link w:val="NotedebasdepageCar"/>
+    <w:link w:val="FootnoteTextChar"/>
   </w:style>
-  <w:style w:type="paragraph" w:styleId="Titre">
+  <w:style w:type="paragraph" w:styleId="Title">
     <w:name w:val="Title"/>
     <w:basedOn w:val="Normal"/>
     <w:next w:val="Normal"/>
-    <w:link w:val="TitreCar"/>
+    <w:link w:val="TitleChar"/>
     <w:uiPriority w:val="10"/>
     <w:qFormat/>
     <w:rsid w:val="00934C38"/>
@@ -8359,7 +8851,7 @@
       <w:szCs w:val="52"/>
     </w:rPr>
   </w:style>
-  <w:style w:type="paragraph" w:styleId="Paragraphedeliste">
+  <w:style w:type="paragraph" w:styleId="ListParagraph">
     <w:name w:val="List Paragraph"/>
     <w:basedOn w:val="Normal"/>
     <w:uiPriority w:val="34"/>
@@ -8397,10 +8889,10 @@
       <w:lang w:val="en-GB" w:eastAsia="zh-CN"/>
     </w:rPr>
   </w:style>
-  <w:style w:type="paragraph" w:styleId="En-tte">
+  <w:style w:type="paragraph" w:styleId="Header">
     <w:name w:val="header"/>
     <w:basedOn w:val="Normal"/>
-    <w:link w:val="En-tteCar"/>
+    <w:link w:val="HeaderChar"/>
     <w:uiPriority w:val="99"/>
     <w:unhideWhenUsed/>
     <w:rsid w:val="00A272CF"/>
@@ -8411,10 +8903,10 @@
       </w:tabs>
     </w:pPr>
   </w:style>
-  <w:style w:type="paragraph" w:styleId="Pieddepage">
+  <w:style w:type="paragraph" w:styleId="Footer">
     <w:name w:val="footer"/>
     <w:basedOn w:val="Normal"/>
-    <w:link w:val="PieddepageCar"/>
+    <w:link w:val="FooterChar"/>
     <w:uiPriority w:val="99"/>
     <w:unhideWhenUsed/>
     <w:rsid w:val="00A272CF"/>
@@ -8430,9 +8922,9 @@
     <w:basedOn w:val="Normal"/>
     <w:qFormat/>
   </w:style>
-  <w:style w:type="character" w:styleId="Hyperlien">
+  <w:style w:type="character" w:styleId="Hyperlink">
     <w:name w:val="Hyperlink"/>
-    <w:basedOn w:val="Policepardfaut"/>
+    <w:basedOn w:val="DefaultParagraphFont"/>
     <w:uiPriority w:val="99"/>
     <w:unhideWhenUsed/>
     <w:rsid w:val="00464662"/>
@@ -8441,9 +8933,9 @@
       <w:u w:val="single"/>
     </w:rPr>
   </w:style>
-  <w:style w:type="character" w:styleId="Mentionnonrsolue">
+  <w:style w:type="character" w:styleId="UnresolvedMention">
     <w:name w:val="Unresolved Mention"/>
-    <w:basedOn w:val="Policepardfaut"/>
+    <w:basedOn w:val="DefaultParagraphFont"/>
     <w:uiPriority w:val="99"/>
     <w:rsid w:val="00464662"/>
     <w:rPr>

</xml_diff>